<commit_message>
Small updates to prep file
</commit_message>
<xml_diff>
--- a/MA_Article.docx
+++ b/MA_Article.docx
@@ -299,7 +299,7 @@
         <w:pStyle w:val="BodyText"/>
       </w:pPr>
       <w:r>
-        <w:t xml:space="preserve">In the Meta-Analysis (Section 3), vehicle type is considered as well as safety focus, and was found to be an important consideration in measuring DSFS effectiveness. Across all of the hypotheses and safety foci considered, passenger cars demonstrated larger reductions in mean vehicle speed than trucks. Considering the effect of DSFS activation (see below), the size of the effect for passenger cars was approximately double for passenger cars (4 mph), compared to trucks (2 mph). These effects of safety foci and vehicle type were considered for each of method of assessing DSFS effectiveness.</w:t>
+        <w:t xml:space="preserve">Vehicle type was found to be an important consideration in measuring DSFS effectiveness. Across all of the hypotheses and safety foci considered, passenger cars demonstrated larger reductions in mean vehicle speed than trucks. Considering the effect of DSFS activation (see below), the size of the effect for passenger cars was approximately double for passenger cars (4 mph), compared to trucks (2 mph). These effects of safety foci and vehicle type were considered for each of method of assessing DSFS effectiveness.</w:t>
       </w:r>
     </w:p>
     <w:p>
@@ -309,25 +309,13 @@
       <w:r>
         <w:t xml:space="preserve">In deciding if and in what situation to install a DSFS, traffic engineers must consider what type of speed reduction effect is desired. As there are different types of outcomes possible, measuring the effect of DSFS installation requires considering the desired outcome and what the baseline comparison case should be. This study considers three types of effects that DSFS can have on vehicle speeds: the Activation Hypothesis, the Downstream Hypothesis, and the Deactivation Hypothesis. Published studies consider different combinations of these effects by different names, and this study combines them all into a unified framework for the first time.</w:t>
       </w:r>
-      <w:r>
-        <w:t xml:space="preserve"> </w:t>
-      </w:r>
-      <w:r>
-        <w:t xml:space="preserve">The Activation Hypothesis can be directly tested as the change in speed of a vehicle at a given location, comparing speeds prior to installation of a DSFS to speeds when the sign is installed and active (Figure 1). In the case where a DSFS is intended to reduce driver speeds immediately at a specific location, the Activation Hypothesis is the appropriate test to focus on. This measure is commonly made in the literature, and is adequate for a considering in general how much a DSFS can reduce driver speed. One consideration, however, is that roadway conditions may have changed between the two time points that are measured, so that vehicle speeds may differ for reasons other than the DSFS installation.</w:t>
-      </w:r>
     </w:p>
     <w:p>
       <w:pPr>
         <w:pStyle w:val="BodyText"/>
       </w:pPr>
       <w:r>
-        <w:t xml:space="preserve">An alternative method that studies have used to address the Activation Hypothesis is by measuring speeds at one time point, comparing vehicle speeds upstream of the site of DSFS installation to speeds adjacent to the DSFS (Figure 2). As with the "same site" measurement, this measurement method also may include changes in speed driven by factors besides the DSFS installation. Particularly since DSFS are installed at sites where vehicle speeds are expected to reduce, such as prior to a school zone or along a horizontal curve, this measurement of the Activation Hypothesis is expected to only partly reflect the effect of the DSFS itself. Both of these first two measures of the activation effect have merit, and in the literature both show significant reductions in vehicle speed, but do not fully isolate the effect of the DSFS from other roadway factors.</w:t>
-      </w:r>
-      <w:r>
-        <w:t xml:space="preserve"> </w:t>
-      </w:r>
-      <w:r>
-        <w:t xml:space="preserve">To most accurately capture the effect of DSFS in reducing speed, ideally both aspects of changes in speed at the two sites (upstream and adjacent) and at the two points in time (prior to installation and during installation) would be considered. This normalized test of the Activation Hypothesis is shows in Figure 3, and accounts for differences in speed which may be due to any factors other than the DSFS itself. This measure of DSFS effectiveness is referred to in this study as a normalized effect, and was encountered less often in the literature, but should be considered the most accurate representation of the activation effect of DSFS in reducing driver speeds.</w:t>
+        <w:t xml:space="preserve">The Activation Hypothesis can be directly tested as the change in speed of a vehicle at a given location, comparing speeds prior to installation of a DSFS to speeds when the sign is installed and active (Figure 1). In the case where a DSFS is intended to reduce driver speeds immediately at a specific location, the Activation Hypothesis is the appropriate test to focus on. This measure is commonly made in the literature, and is adequate for a considering in general how much a DSFS can reduce driver speed. One consideration, however, is that roadway conditions may have changed between the two time points that are measured, so that vehicle speeds may differ for reasons other than the DSFS installation.</w:t>
       </w:r>
     </w:p>
     <w:p>
@@ -335,13 +323,13 @@
         <w:pStyle w:val="BodyText"/>
       </w:pPr>
       <w:r>
-        <w:t xml:space="preserve">Safety officials may also consider installing a DSFS upstream of a zone of safety focus. For instance, well upstream of a transition zone between a rural highway and a settled area, it may be desired to begin tapering vehicle speeds. In this case, considering the Downstream Hypothesis would be appropriate. If the sign is placed too far upstream of the location of interest, vehicle speeds may recover to prior levels, so assessing the distance between the sign and the measurement location is critical. Just as for the Activation Hypothesis, considerations of the baseline comparison case are important, and in the literature both comparisons at the same time (Figure 4. Downstream Hypothesis, same time.Figure 4) and same site are presented. The Downstream Hypothesis has more variations than the Activation Hypothesis, since it is possible to consider both the site adjacent to the DSFS or upstream of the DSFS as baseline comparisons. These considerations are discussed further in the Literature Review and Meta-analysis sections of this report.</w:t>
+        <w:t xml:space="preserve">An alternative method that studies have used to address the Activation Hypothesis is by measuring speeds at one time point, comparing vehicle speeds upstream of the site of DSFS installation to speeds adjacent to the DSFS (Figure 2). As with the "same site" measurement, this measurement method also may include changes in speed driven by factors besides the DSFS installation. Particularly since DSFS are installed at sites where vehicle speeds are expected to reduce, such as prior to a school zone or along a horizontal curve, this measurement of the Activation Hypothesis is expected to only partly reflect the effect of the DSFS itself. Both of these first two measures of the activation effect have merit, and in the literature both show significant reductions in vehicle speed, but do not fully isolate the effect of the DSFS from other roadway factors.</w:t>
       </w:r>
       <w:r>
         <w:t xml:space="preserve"> </w:t>
       </w:r>
       <w:r>
-        <w:t xml:space="preserve">Finally, safety officials may consider temporarily installing a DSFS, for example as part of a mobile operation in a work zone or as a test case to evaluate DSFS effectiveness. Upon removal of the DSFS, it is possible that a 'halo' effect of continued reductions in driver speed may be observed. Some authors have tested this Deactivation Hypothesis. As with the Downstream Hypothesis, there are number of combinations of measurement in time and space which are possible (Figure 5). For deactivation effects as shown in Figure 5, the published literture indicates that these halo effects can occur, although too few studies have been conducted to assess the statistical significance of this effect.</w:t>
+        <w:t xml:space="preserve">To most accurately capture the effect of DSFS in reducing speed, ideally both aspects of changes in speed at the two sites (upstream and adjacent) and at the two points in time (prior to installation and during installation) would be considered. This normalized test of the Activation Hypothesis is shows in Figure 3, and accounts for differences in speed which may be due to any factors other than the DSFS itself. This measure of DSFS effectiveness is referred to in this study as a normalized effect, and was encountered less often in the literature, but should be considered the most accurate representation of the activation effect of DSFS in reducing driver speeds.</w:t>
       </w:r>
     </w:p>
     <w:p>
@@ -349,11 +337,25 @@
         <w:pStyle w:val="BodyText"/>
       </w:pPr>
       <w:r>
-        <w:t xml:space="preserve">These different hypotheses represent different goals that highway engineers and safety officials may have in reducing driver speeds. The published literature includes all of these variations, and this report presents these hypotheses in a unified framework. By reviewing results and re-analyzing the data from the published literature, this report shows that DSFS are effective in reducing vehicle speeds in all cases with sufficient data. The speed reductions of 4 mph for passenger cars can lead to substantial reductions in speeding-related crashes, reducing the human toll of fatal crashes.</w:t>
+        <w:t xml:space="preserve">Safety officials may also consider installing a DSFS upstream of a zone of safety focus. For instance, well upstream of a transition zone between a rural highway and a settled area, it may be desired to begin tapering vehicle speeds. In this case, considering the Downstream Hypothesis would be appropriate. If the sign is placed too far upstream of the location of interest, vehicle speeds may recover to prior levels, so assessing the distance between the sign and the measurement location is critical. Just as for the Activation Hypothesis, considerations of the baseline comparison case are important, and in the literature both comparisons at the same time (Figure 4. Downstream Hypothesis, same time.Figure 4) and same site are presented. The Downstream Hypothesis has more variations than the Activation Hypothesis, since it is possible to consider both the site adjacent to the DSFS or upstream of the DSFS as baseline comparisons. These considerations are discussed further in the Literature Review and Meta-analysis sections of this report.</w:t>
+      </w:r>
+      <w:r>
+        <w:t xml:space="preserve"> </w:t>
+      </w:r>
+      <w:r>
+        <w:t xml:space="preserve">Finally, safety officials may consider temporarily installing a DSFS, for example as part of a mobile operation in a work zone or as a test case to evaluate DSFS effectiveness. Upon removal of the DSFS, it is possible that a 'halo' effect of continued reductions in driver speed may be observed. Some authors have tested this Deactivation Hypothesis. As with the Downstream Hypothesis, there are number of combinations of measurement in time and space which are possible (Figure 5). For deactivation effects as shown in Figure 5, the published literture indicates that these halo effects can occur, although too few studies have been conducted to assess the statistical significance of this effect.</w:t>
       </w:r>
     </w:p>
     <w:p>
       <w:pPr>
+        <w:pStyle w:val="BodyText"/>
+      </w:pPr>
+      <w:r>
+        <w:t xml:space="preserve">These different hypotheses represent different goals that highway engineers and safety officials may have in reducing driver speeds. The published literature includes all of these variations, and this report presents these hypotheses in a unified framework. By reviewing results and re-analyzing the data from the published literature, this report shows that DSFS are effective in reducing vehicle speeds in all cases with sufficient data. The speed reductions of 4 mph for passenger cars can lead to substantial reductions in speeding-related crashes, reducing the human toll of fatal crashes.</w:t>
+      </w:r>
+    </w:p>
+    <w:p>
+      <w:pPr>
         <w:pStyle w:val="Heading1"/>
       </w:pPr>
       <w:bookmarkStart w:id="24" w:name="methods"/>
@@ -377,13 +379,41 @@
         <w:pStyle w:val="FirstParagraph"/>
       </w:pPr>
       <w:r>
-        <w:t xml:space="preserve">Candidate publications were identified by a search of the following databases: Transport Research International Documentation (TRID), National Transportation Library (NTL), WorldShare, Academic Search Complete, PsycINFO, Web of Science, and Science Direct. The searches were carried out between 3/9/2016 and 3/16/2016 by research librarians. A full list of the search terms is provided in Table 1.</w:t>
-      </w:r>
-      <w:r>
-        <w:t xml:space="preserve"> </w:t>
-      </w:r>
-      <w:r>
-        <w:t xml:space="preserve">Data were entered at two levels:</w:t>
+        <w:t xml:space="preserve">Candidate publications were identified by a search of the following databases: Transport Research International Documentation (TRID), National Transportation Library (NTL), WorldShare, Academic Search Complete, PsycINFO, Web of Science, and Science Direct. The searches were carried out between 3/9/2016 and 3/16/2016 by research librarians. A total of 108 national and international publications were identified in the initial literature search. Focusing on the domestic studies, 77 studies were reviewed, of which 43 passed the relevance and quality screening.</w:t>
+      </w:r>
+    </w:p>
+    <w:p>
+      <w:pPr>
+        <w:pStyle w:val="BodyText"/>
+      </w:pPr>
+      <w:r>
+        <w:t xml:space="preserve">For calculations of effect size (see below), at a minimum a study would have to report the mean and standard deviation (SD) of vehicle speeds, as well as the number of vehicles observed, at either two points in time or two locations. The difference in whether studies focused on different timing or location of vehicle speed data collection determines which hypotheses can be tested (see section titled Calculating effect size).</w:t>
+      </w:r>
+    </w:p>
+    <w:p>
+      <w:pPr>
+        <w:pStyle w:val="BodyText"/>
+      </w:pPr>
+      <w:r>
+        <w:t xml:space="preserve">Publications in some cases included more than one study, meaning they tested DSFS at different locations or in combinations with additional treatments such as police cruisers or speed radar enforcement; these are treated as separate studies in the data collection, grouped under the same publication ID. Publications employed many different combinations of descriptors in the study design, and effort was made to enter data from any relevant descriptor that could be expected to appear in multiple studies. Key descriptors included posted speed, safety focus, vehicle type, sign type, and distance from sign the vehicle speeds were measured.</w:t>
+      </w:r>
+    </w:p>
+    <w:p>
+      <w:pPr>
+        <w:pStyle w:val="Heading2"/>
+      </w:pPr>
+      <w:bookmarkStart w:id="26" w:name="calculating-effect-size"/>
+      <w:bookmarkEnd w:id="26"/>
+      <w:r>
+        <w:t xml:space="preserve">Calculating Effect Size</w:t>
+      </w:r>
+    </w:p>
+    <w:p>
+      <w:pPr>
+        <w:pStyle w:val="FirstParagraph"/>
+      </w:pPr>
+      <w:r>
+        <w:t xml:space="preserve">Meta-analyses were initially used primarily to assess the odds of a particular outcome, such as the odds a drug treatment would result in a favorable outcome for a patient, and then were expanded to more generally test the size and direction of the outcome across different studies. Both types of tests, assessing odds of a categorical outcome or size of a continuous outcome, are dependent on calculating the effect size. For the meta-analysis of DSFS, the outcomes are vehicle speeds at different points in time. Three sets of hypotheses regarding the effectiveness of DSFS can be tested, and each requires a different calculation of effect size. These hypotheses are discussed in detail in the Introduction, and summarized here:</w:t>
       </w:r>
     </w:p>
     <w:p>
@@ -395,7 +425,43 @@
         </w:numPr>
       </w:pPr>
       <w:r>
-        <w:t xml:space="preserve">the descriptor level, which describes the characteristics of each study (the features which identify how the DSFS was implemented, the hypotheses that were evaluated, and the experimental design)</w:t>
+        <w:t xml:space="preserve">H1. Activation of the DSFS. How much the installation of DSFS reduces driver speed is the central question for this analysis. The studies tested activation in three ways:</w:t>
+      </w:r>
+    </w:p>
+    <w:p>
+      <w:pPr>
+        <w:pStyle w:val="Compact"/>
+        <w:numPr>
+          <w:numId w:val="1002"/>
+          <w:ilvl w:val="1"/>
+        </w:numPr>
+      </w:pPr>
+      <w:r>
+        <w:t xml:space="preserve">Compare the difference between the upstream and adjacent vehicle speeds before activation to the difference between the upstream and adjacent vehicle speeds during activation of the DSFS. This is the ideal comparison, or the true effect (Cruzado and Donnell 2009).</w:t>
+      </w:r>
+    </w:p>
+    <w:p>
+      <w:pPr>
+        <w:pStyle w:val="Compact"/>
+        <w:numPr>
+          <w:numId w:val="1002"/>
+          <w:ilvl w:val="1"/>
+        </w:numPr>
+      </w:pPr>
+      <w:r>
+        <w:t xml:space="preserve">Compare vehicle speeds adjacent to the DSFS before activation and then during activation</w:t>
+      </w:r>
+    </w:p>
+    <w:p>
+      <w:pPr>
+        <w:pStyle w:val="Compact"/>
+        <w:numPr>
+          <w:numId w:val="1002"/>
+          <w:ilvl w:val="1"/>
+        </w:numPr>
+      </w:pPr>
+      <w:r>
+        <w:t xml:space="preserve">Compare vehicle speeds upstream (of the DSFS) and adjacent (to the DSFS)</w:t>
       </w:r>
     </w:p>
     <w:p>
@@ -407,51 +473,7 @@
         </w:numPr>
       </w:pPr>
       <w:r>
-        <w:t xml:space="preserve">the data level, which was the least-aggregated level of data reported either in tabular or graphical format in the publication. For calculations of effect size, at a minimum a study would have to report the mean and standard deviation (SD) of vehicle speeds, as well as the number of vehicles observed, at either two points in time or two locations. The difference in whether studies focused on different timing or location of vehicle speed data collection determines which hypotheses can be tested (see section titled Calculating effect size).</w:t>
-      </w:r>
-    </w:p>
-    <w:p>
-      <w:pPr>
-        <w:pStyle w:val="FirstParagraph"/>
-      </w:pPr>
-      <w:r>
-        <w:t xml:space="preserve">Publications in some cases included more than one study, meaning they tested DSFS at different locations or in combinations with additional treatments such as police cruisers or speed radar enforcement; these are treated as separate studies in the data collection, grouped under the same publication ID. Publications employed many different combinations of descriptors in the study design, and effort was made to enter data from any relevant descriptor that could be expected to appear in multiple studies. Key descriptors included posted speed, safety focus, vehicle type, sign type, and distance from sign the vehicle speeds were measured.</w:t>
-      </w:r>
-    </w:p>
-    <w:p>
-      <w:pPr>
-        <w:pStyle w:val="Heading2"/>
-      </w:pPr>
-      <w:bookmarkStart w:id="26" w:name="calculating-effect-size"/>
-      <w:bookmarkEnd w:id="26"/>
-      <w:r>
-        <w:t xml:space="preserve">Calculating Effect Size</w:t>
-      </w:r>
-    </w:p>
-    <w:p>
-      <w:pPr>
-        <w:pStyle w:val="FirstParagraph"/>
-      </w:pPr>
-      <w:r>
-        <w:t xml:space="preserve">Meta-analyses were initially used primarily to assess the odds of a particular outcome, such as the odds a drug treatment would result in a favorable outcome for a patient, and then were expanded to more generally test the size and direction of the outcome across different studies. Both types of tests, assessing odds of a categorical outcome or size of a continuous outcome, are dependent on calculating the effect size. For the meta-analysis of DSFS, the outcomes are vehicle speeds at different points in time.</w:t>
-      </w:r>
-      <w:r>
-        <w:t xml:space="preserve"> </w:t>
-      </w:r>
-      <w:r>
-        <w:t xml:space="preserve">Three sets of hypotheses regarding the effectiveness of DSFS can tested, and each requires a different calculation of effect size:</w:t>
-      </w:r>
-    </w:p>
-    <w:p>
-      <w:pPr>
-        <w:pStyle w:val="Compact"/>
-        <w:numPr>
-          <w:numId w:val="1002"/>
-          <w:ilvl w:val="0"/>
-        </w:numPr>
-      </w:pPr>
-      <w:r>
-        <w:t xml:space="preserve">H1. Activation of the DSFS. How much the installation of DSFS reduces driver speed is the central question for this analysis. The studies tested activation in three ways:</w:t>
+        <w:t xml:space="preserve">H2. Activation of the DSFS: downstream. The studies tested the activation effect downstream in three ways:</w:t>
       </w:r>
     </w:p>
     <w:p>
@@ -463,7 +485,7 @@
         </w:numPr>
       </w:pPr>
       <w:r>
-        <w:t xml:space="preserve">Compare vehicle speeds adjacent to the DSFS before activation and then during activation</w:t>
+        <w:t xml:space="preserve">Compare a difference of differences which controls for variations in both the time at which the vehicle speeds (before and during activation) are measured and the location at which the vehicle speeds are measured (upstream and downstream).</w:t>
       </w:r>
     </w:p>
     <w:p>
@@ -475,7 +497,7 @@
         </w:numPr>
       </w:pPr>
       <w:r>
-        <w:t xml:space="preserve">compare vehicle speeds upstream (of the DSFS) and adjacent (to the DSFS)</w:t>
+        <w:t xml:space="preserve">Compare downstream vehicle speeds during activation to downstream vehicle speeds before activation,</w:t>
       </w:r>
     </w:p>
     <w:p>
@@ -487,75 +509,39 @@
         </w:numPr>
       </w:pPr>
       <w:r>
-        <w:t xml:space="preserve">Compare the difference between the upstream and adjacent vehicle speeds before activation to the difference between the upstream and adjacent vehicle speeds during activation of the DSFS. This is the ideal comparison, or the true effect (Cruzado and Donnell 2009).</w:t>
+        <w:t xml:space="preserve">Compare downstream vehicle speeds to upstream vehicle speeds during activation,</w:t>
+      </w:r>
+      <w:r>
+        <w:t xml:space="preserve"> </w:t>
+      </w:r>
+      <w:r>
+        <w:t xml:space="preserve">A'. Compare a difference of differences which controls for variations in both the time at which the vehicle speeds (before and during activation) are measured and the location at which the vehicle speeds are measured (adjacent and downstream),</w:t>
+      </w:r>
+      <w:r>
+        <w:t xml:space="preserve"> </w:t>
+      </w:r>
+      <w:r>
+        <w:t xml:space="preserve">C'. Compare downstream vehicle speed to adjacent speeds during activation.</w:t>
       </w:r>
     </w:p>
     <w:p>
       <w:pPr>
         <w:pStyle w:val="Compact"/>
         <w:numPr>
-          <w:numId w:val="1002"/>
+          <w:numId w:val="1001"/>
           <w:ilvl w:val="0"/>
         </w:numPr>
       </w:pPr>
       <w:r>
-        <w:t xml:space="preserve">H2. Activation of the DSFS: downstream. The studies tested the activation effect downstream in three ways:</w:t>
+        <w:t xml:space="preserve">H3. Deactivation of the DSFS. The comparisons are similar to the above, but now vehicle speeds are compared at the DSFS location after the DSFS has been removed to vehicle speeds at the DSFS while the DSFS was activated, or a normalized difference from after to before or after to during installation.</w:t>
       </w:r>
     </w:p>
     <w:p>
       <w:pPr>
-        <w:pStyle w:val="Compact"/>
-        <w:numPr>
-          <w:numId w:val="1004"/>
-          <w:ilvl w:val="1"/>
-        </w:numPr>
-      </w:pPr>
-      <w:r>
-        <w:t xml:space="preserve">Compare downstream vehicle speeds during activation to downstream vehicle speeds before activation,</w:t>
-      </w:r>
-    </w:p>
-    <w:p>
-      <w:pPr>
-        <w:pStyle w:val="Compact"/>
-        <w:numPr>
-          <w:numId w:val="1004"/>
-          <w:ilvl w:val="1"/>
-        </w:numPr>
-      </w:pPr>
-      <w:r>
-        <w:t xml:space="preserve">Compare downstream vehicle speeds adjacent to the DSFS during activation,</w:t>
-      </w:r>
-    </w:p>
-    <w:p>
-      <w:pPr>
-        <w:pStyle w:val="Compact"/>
-        <w:numPr>
-          <w:numId w:val="1004"/>
-          <w:ilvl w:val="1"/>
-        </w:numPr>
-      </w:pPr>
-      <w:r>
-        <w:t xml:space="preserve">Compare a difference of differences which controls for variations in both the time at which the vehicle speeds are measured and the location at which the vehicle speeds are measured.</w:t>
-      </w:r>
-    </w:p>
-    <w:p>
-      <w:pPr>
-        <w:pStyle w:val="Compact"/>
-        <w:numPr>
-          <w:numId w:val="1002"/>
-          <w:ilvl w:val="0"/>
-        </w:numPr>
-      </w:pPr>
-      <w:r>
-        <w:t xml:space="preserve">H3. Deactivation of the DSFS. The comparisons are similar to the above, but now vehicle speeds are compared at the DSFS location after the DSFS has been removed to vehicle speeds at the DSFS while the DSFS was activated, or a normalized difference from after to before or after to during installation.</w:t>
-      </w:r>
-    </w:p>
-    <w:p>
-      <w:pPr>
         <w:pStyle w:val="FirstParagraph"/>
       </w:pPr>
       <w:r>
-        <w:t xml:space="preserve">We estimate the effect size (</w:t>
+        <w:t xml:space="preserve">We calculate the effect size (</w:t>
       </w:r>
       <w:r>
         <w:rPr>
@@ -1816,7 +1802,7 @@
         <w:pStyle w:val="FirstParagraph"/>
       </w:pPr>
       <w:r>
-        <w:t xml:space="preserve">This meta-analysis investigates a single continuous outcome (speed of vehicles) across multiple studies, with several moderating variables (e.g., posted speed, safety focus, time of day). The use of multiple moderating variables in a meta-analysis has also been called meta-regression (van Houwelingen, Arends and Stijnen 2002). This type of analysis is best conducted using a mixed-effect model, where studies are the random effects, and the moderating variables are the fixed effects. "Random effects" refers to variables in the model which are assumed to be representatives of a larger population (Raudenbush 2009, Hedges and Vevea 1998), which in this case are the publications and studies within each publication. The studies examined in this analysis are assumed to be representatives of other possible studies that might have been done. Statistically, random effects are variables which are themselves modeled, with their own error terms. "Fixed effects" refers to predictor variables in the model which are directly measured for each study.</w:t>
+        <w:t xml:space="preserve">This meta-analysis investigates a single continuous outcome (speed of vehicles) across multiple studies, with several moderating variables (e.g., posted speed, safety focus, time of day). The use of multiple moderating variables in a meta-analysis has also been called meta-regression (van Houwelingen, Arends and Stijnen 2002). This type of analysis is best conducted using a mixed-effect model, where studies are the random effects, and the moderating variables are the fixed effects. "Random effects" refers to variables in the model which are assumed to be representatives of a larger population (Raudenbush 2009, Hedges and Vevea 1998), which in this case are the publications and studies within each publication. The studies examined in this analysis are assumed to be representatives of other possible studies that might have been done. Statistically, random effects are variables which are themselves modeled, with their own error terms. "Fixed effects" refers to predictor variables in the model which are directly measured for each study. When possible, the full model was employed as follows:</w:t>
       </w:r>
     </w:p>
     <w:p>
@@ -1919,37 +1905,52 @@
             </m:sub>
           </m:sSub>
           <m:r>
-            <m:t>v</m:t>
+            <m:t>d</m:t>
+          </m:r>
+          <m:r>
+            <m:t>i</m:t>
+          </m:r>
+          <m:r>
+            <m:t>s</m:t>
+          </m:r>
+          <m:r>
+            <m:t>t</m:t>
+          </m:r>
+          <m:r>
+            <m:t>a</m:t>
+          </m:r>
+          <m:r>
+            <m:t>n</m:t>
+          </m:r>
+          <m:r>
+            <m:t>c</m:t>
           </m:r>
           <m:r>
             <m:t>e</m:t>
           </m:r>
           <m:r>
-            <m:t>h</m:t>
+            <m:t>f</m:t>
+          </m:r>
+          <m:r>
+            <m:t>r</m:t>
+          </m:r>
+          <m:r>
+            <m:t>o</m:t>
+          </m:r>
+          <m:r>
+            <m:t>m</m:t>
+          </m:r>
+          <m:r>
+            <m:t>s</m:t>
           </m:r>
           <m:r>
             <m:t>i</m:t>
           </m:r>
           <m:r>
-            <m:t>c</m:t>
+            <m:t>g</m:t>
           </m:r>
           <m:r>
-            <m:t>l</m:t>
-          </m:r>
-          <m:r>
-            <m:t>e</m:t>
-          </m:r>
-          <m:r>
-            <m:t>t</m:t>
-          </m:r>
-          <m:r>
-            <m:t>y</m:t>
-          </m:r>
-          <m:r>
-            <m:t>p</m:t>
-          </m:r>
-          <m:r>
-            <m:t>e</m:t>
+            <m:t>n</m:t>
           </m:r>
           <m:r>
             <m:t>+</m:t>
@@ -1957,55 +1958,7 @@
           <m:sSub>
             <m:e>
               <m:r>
-                <m:t>β</m:t>
-              </m:r>
-            </m:e>
-            <m:sub>
-              <m:r>
-                <m:t>3</m:t>
-              </m:r>
-            </m:sub>
-          </m:sSub>
-          <m:r>
-            <m:t>s</m:t>
-          </m:r>
-          <m:r>
-            <m:t>a</m:t>
-          </m:r>
-          <m:r>
-            <m:t>f</m:t>
-          </m:r>
-          <m:r>
-            <m:t>e</m:t>
-          </m:r>
-          <m:r>
-            <m:t>t</m:t>
-          </m:r>
-          <m:r>
-            <m:t>y</m:t>
-          </m:r>
-          <m:r>
-            <m:t>f</m:t>
-          </m:r>
-          <m:r>
-            <m:t>o</m:t>
-          </m:r>
-          <m:r>
-            <m:t>c</m:t>
-          </m:r>
-          <m:r>
-            <m:t>u</m:t>
-          </m:r>
-          <m:r>
-            <m:t>s</m:t>
-          </m:r>
-          <m:r>
-            <m:t>+</m:t>
-          </m:r>
-          <m:sSub>
-            <m:e>
-              <m:r>
-                <m:t>u</m:t>
+                <m:t>U</m:t>
               </m:r>
             </m:e>
             <m:sub>
@@ -2095,7 +2048,10 @@
         </m:sSub>
       </m:oMath>
       <w:r>
-        <w:t xml:space="preserve">,</w:t>
+        <w:t xml:space="preserve"> </w:t>
+      </w:r>
+      <w:r>
+        <w:t xml:space="preserve">and</w:t>
       </w:r>
       <w:r>
         <w:t xml:space="preserve"> </w:t>
@@ -2115,7 +2071,18 @@
         </m:sSub>
       </m:oMath>
       <w:r>
-        <w:t xml:space="preserve">, and</w:t>
+        <w:t xml:space="preserve"> </w:t>
+      </w:r>
+      <w:r>
+        <w:t xml:space="preserve">refer to the coefficients for each of the predictor variables. In many cases the posted speed and distance from sign values were not available, thus this report focuses on overall speed reduction effect sizes.</w:t>
+      </w:r>
+    </w:p>
+    <w:p>
+      <w:pPr>
+        <w:pStyle w:val="BodyText"/>
+      </w:pPr>
+      <w:r>
+        <w:t xml:space="preserve">The error term has multiple parts. The first term</w:t>
       </w:r>
       <w:r>
         <w:t xml:space="preserve"> </w:t>
@@ -2124,12 +2091,12 @@
         <m:sSub>
           <m:e>
             <m:r>
-              <m:t>β</m:t>
+              <m:t>U</m:t>
             </m:r>
           </m:e>
           <m:sub>
             <m:r>
-              <m:t>3</m:t>
+              <m:t>i</m:t>
             </m:r>
           </m:sub>
         </m:sSub>
@@ -2138,15 +2105,7 @@
         <w:t xml:space="preserve"> </w:t>
       </w:r>
       <w:r>
-        <w:t xml:space="preserve">refer to the coefficients for each of the predictor variables.</w:t>
-      </w:r>
-    </w:p>
-    <w:p>
-      <w:pPr>
-        <w:pStyle w:val="BodyText"/>
-      </w:pPr>
-      <w:r>
-        <w:t xml:space="preserve">The error term has two parts, first the study-level error term</w:t>
+        <w:t xml:space="preserve">represents the random effects, which for this model include the effect of study, nested within publication, as well as safety focus and vehicle type. For example, the study-level error term</w:t>
       </w:r>
       <w:r>
         <w:t xml:space="preserve"> </w:t>
@@ -2166,7 +2125,10 @@
         </m:sSub>
       </m:oMath>
       <w:r>
-        <w:t xml:space="preserve">, which is defined as</w:t>
+        <w:t xml:space="preserve"> </w:t>
+      </w:r>
+      <w:r>
+        <w:t xml:space="preserve">is defined as</w:t>
       </w:r>
       <w:r>
         <w:t xml:space="preserve"> </w:t>
@@ -2236,7 +2198,15 @@
         </m:sSup>
       </m:oMath>
       <w:r>
-        <w:t xml:space="preserve">; this variance is estimated in the model, and is the random effect in the model. As a random effect, it represents the variability assumed from the larger population of studies from which the specific studies used have been drawn. The remaining error term</w:t>
+        <w:t xml:space="preserve">; this variance is estimated in the model, and is the random effect in the model. As a random effect, it represents the variability assumed from the larger population of studies from which the specific studies used have been drawn. The random effects allow the model to fit unbalanced data, which is the case for all the hypotheses tested, and to account for the hierarchical nature of the data, with multiple studies being conducted in some publications. This mixed effect approach (mixing random and fixed effects) allows estimates for how the different levels of the random effects contribute to the overall effect, for instance how passenger cars differ from commercial motor vehicles in their response to DSFS installations.</w:t>
+      </w:r>
+    </w:p>
+    <w:p>
+      <w:pPr>
+        <w:pStyle w:val="BodyText"/>
+      </w:pPr>
+      <w:r>
+        <w:t xml:space="preserve">The remaining error term</w:t>
       </w:r>
       <w:r>
         <w:t xml:space="preserve"> </w:t>
@@ -2383,7 +2353,7 @@
         <w:pStyle w:val="BodyText"/>
       </w:pPr>
       <w:r>
-        <w:t xml:space="preserve">For each of the 13 hypotheses tested, a similar structure of models was used. Establishing which moderator variables (descriptors) should be used will be the critical step in the analysis, as not all studies provide complete information on all of the moderating variables.</w:t>
+        <w:t xml:space="preserve">For each of the 13 hypotheses tested, a similar structure of models was used. Establishing which fixed and random effect variables could be used depended on data availability. At a minimum, the statistical analysis always included a term for study, nested within publication ID. Safety focus and vehicle type were included as random effects in nearly all models. Posted speed and distance from DSFS were available for only a subset of the hypothesis tests.</w:t>
       </w:r>
     </w:p>
     <w:p>
@@ -2508,20 +2478,18 @@
     </w:p>
     <w:p>
       <w:pPr>
-        <w:pStyle w:val="Heading1"/>
-      </w:pPr>
-      <w:bookmarkStart w:id="28" w:name="results"/>
-      <w:bookmarkEnd w:id="28"/>
-      <w:r>
-        <w:t xml:space="preserve">Results</w:t>
+        <w:pStyle w:val="BodyText"/>
+      </w:pPr>
+      <w:r>
+        <w:t xml:space="preserve">S# Results</w:t>
       </w:r>
     </w:p>
     <w:p>
       <w:pPr>
         <w:pStyle w:val="Heading2"/>
       </w:pPr>
-      <w:bookmarkStart w:id="29" w:name="summary-of-data"/>
-      <w:bookmarkEnd w:id="29"/>
+      <w:bookmarkStart w:id="28" w:name="summary-of-data"/>
+      <w:bookmarkEnd w:id="28"/>
       <w:r>
         <w:t xml:space="preserve">Summary of data</w:t>
       </w:r>
@@ -3966,8 +3934,8 @@
       <w:pPr>
         <w:pStyle w:val="Heading2"/>
       </w:pPr>
-      <w:bookmarkStart w:id="30" w:name="h1-activation-hypothesis"/>
-      <w:bookmarkEnd w:id="30"/>
+      <w:bookmarkStart w:id="29" w:name="h1-activation-hypothesis"/>
+      <w:bookmarkEnd w:id="29"/>
       <w:r>
         <w:t xml:space="preserve">H1: Activation hypothesis</w:t>
       </w:r>
@@ -3984,8 +3952,8 @@
       <w:pPr>
         <w:pStyle w:val="Heading3"/>
       </w:pPr>
-      <w:bookmarkStart w:id="31" w:name="h1a-activation-normalized"/>
-      <w:bookmarkEnd w:id="31"/>
+      <w:bookmarkStart w:id="30" w:name="h1a-activation-normalized"/>
+      <w:bookmarkEnd w:id="30"/>
       <w:r>
         <w:t xml:space="preserve">H1A: Activation normalized</w:t>
       </w:r>
@@ -4728,10 +4696,881 @@
     </w:tbl>
     <w:p>
       <w:pPr>
+        <w:pStyle w:val="BodyText"/>
+      </w:pPr>
+      <w:r>
+        <w:t xml:space="preserve">Influence of posted speed and distance is not as strong.</w:t>
+      </w:r>
+    </w:p>
+    <w:p>
+      <w:pPr>
+        <w:pStyle w:val="TableCaption"/>
+      </w:pPr>
+      <w:r>
+        <w:t xml:space="preserve">Table 5. Summary of mixed effect model of hypothesis H1A, difference in speeds betwen DSFS before and at time of activation, normalized to the difference before and at time of activation upstream of the sign, with posted speed and distance from sign included.</w:t>
+      </w:r>
+    </w:p>
+    <w:tbl>
+      <w:tblPr>
+        <w:tblStyle w:val="TableNormal"/>
+        <w:tblW w:type="pct" w:w="0.0"/>
+        <w:tblLook w:firstRow="1"/>
+        <w:tblCaption w:val="Table 5. Summary of mixed effect model of hypothesis H1A, difference in speeds betwen DSFS before and at time of activation, normalized to the difference before and at time of activation upstream of the sign, with posted speed and distance from sign included."/>
+      </w:tblPr>
+      <w:tblGrid/>
+      <w:tr>
+        <w:trPr>
+          <w:cnfStyle w:firstRow="1"/>
+        </w:trPr>
+        <w:tc>
+          <w:tcPr>
+            <w:tcBorders>
+              <w:bottom w:val="single"/>
+            </w:tcBorders>
+            <w:vAlign w:val="bottom"/>
+          </w:tcPr>
+          <w:p>
+            <w:pStyle w:val="Compact"/>
+          </w:p>
+        </w:tc>
+        <w:tc>
+          <w:tcPr>
+            <w:tcBorders>
+              <w:bottom w:val="single"/>
+            </w:tcBorders>
+            <w:vAlign w:val="bottom"/>
+          </w:tcPr>
+          <w:p>
+            <w:pPr>
+              <w:pStyle w:val="Compact"/>
+              <w:jc w:val="left"/>
+            </w:pPr>
+            <w:r>
+              <w:t xml:space="preserve">Estimate</w:t>
+            </w:r>
+          </w:p>
+        </w:tc>
+        <w:tc>
+          <w:tcPr>
+            <w:tcBorders>
+              <w:bottom w:val="single"/>
+            </w:tcBorders>
+            <w:vAlign w:val="bottom"/>
+          </w:tcPr>
+          <w:p>
+            <w:pPr>
+              <w:pStyle w:val="Compact"/>
+              <w:jc w:val="left"/>
+            </w:pPr>
+            <w:r>
+              <w:t xml:space="preserve">Std. Error</w:t>
+            </w:r>
+          </w:p>
+        </w:tc>
+        <w:tc>
+          <w:tcPr>
+            <w:tcBorders>
+              <w:bottom w:val="single"/>
+            </w:tcBorders>
+            <w:vAlign w:val="bottom"/>
+          </w:tcPr>
+          <w:p>
+            <w:pPr>
+              <w:pStyle w:val="Compact"/>
+              <w:jc w:val="left"/>
+            </w:pPr>
+            <w:r>
+              <w:t xml:space="preserve">t value</w:t>
+            </w:r>
+          </w:p>
+        </w:tc>
+        <w:tc>
+          <w:tcPr>
+            <w:tcBorders>
+              <w:bottom w:val="single"/>
+            </w:tcBorders>
+            <w:vAlign w:val="bottom"/>
+          </w:tcPr>
+          <w:p>
+            <w:pPr>
+              <w:pStyle w:val="Compact"/>
+              <w:jc w:val="right"/>
+            </w:pPr>
+            <w:r>
+              <w:t xml:space="preserve">p.z</w:t>
+            </w:r>
+          </w:p>
+        </w:tc>
+      </w:tr>
+      <w:tr>
+        <w:tc>
+          <w:p>
+            <w:pPr>
+              <w:pStyle w:val="Compact"/>
+              <w:jc w:val="left"/>
+            </w:pPr>
+            <w:r>
+              <w:t xml:space="preserve">Overall Effect</w:t>
+            </w:r>
+          </w:p>
+        </w:tc>
+        <w:tc>
+          <w:p>
+            <w:pPr>
+              <w:pStyle w:val="Compact"/>
+              <w:jc w:val="left"/>
+            </w:pPr>
+            <w:r>
+              <w:t xml:space="preserve">-2.288</w:t>
+            </w:r>
+          </w:p>
+        </w:tc>
+        <w:tc>
+          <w:p>
+            <w:pPr>
+              <w:pStyle w:val="Compact"/>
+              <w:jc w:val="left"/>
+            </w:pPr>
+            <w:r>
+              <w:t xml:space="preserve">5.334</w:t>
+            </w:r>
+          </w:p>
+        </w:tc>
+        <w:tc>
+          <w:p>
+            <w:pPr>
+              <w:pStyle w:val="Compact"/>
+              <w:jc w:val="left"/>
+            </w:pPr>
+            <w:r>
+              <w:t xml:space="preserve">-0.429</w:t>
+            </w:r>
+          </w:p>
+        </w:tc>
+        <w:tc>
+          <w:p>
+            <w:pPr>
+              <w:pStyle w:val="Compact"/>
+              <w:jc w:val="right"/>
+            </w:pPr>
+            <w:r>
+              <w:t xml:space="preserve">0.6679232</w:t>
+            </w:r>
+          </w:p>
+        </w:tc>
+      </w:tr>
+      <w:tr>
+        <w:tc>
+          <w:p>
+            <w:pPr>
+              <w:pStyle w:val="Compact"/>
+              <w:jc w:val="left"/>
+            </w:pPr>
+            <w:r>
+              <w:t xml:space="preserve">posted.speed</w:t>
+            </w:r>
+          </w:p>
+        </w:tc>
+        <w:tc>
+          <w:p>
+            <w:pPr>
+              <w:pStyle w:val="Compact"/>
+              <w:jc w:val="left"/>
+            </w:pPr>
+            <w:r>
+              <w:t xml:space="preserve">-0.012</w:t>
+            </w:r>
+          </w:p>
+        </w:tc>
+        <w:tc>
+          <w:p>
+            <w:pPr>
+              <w:pStyle w:val="Compact"/>
+              <w:jc w:val="left"/>
+            </w:pPr>
+            <w:r>
+              <w:t xml:space="preserve">0.094</w:t>
+            </w:r>
+          </w:p>
+        </w:tc>
+        <w:tc>
+          <w:p>
+            <w:pPr>
+              <w:pStyle w:val="Compact"/>
+              <w:jc w:val="left"/>
+            </w:pPr>
+            <w:r>
+              <w:t xml:space="preserve">-0.129</w:t>
+            </w:r>
+          </w:p>
+        </w:tc>
+        <w:tc>
+          <w:p>
+            <w:pPr>
+              <w:pStyle w:val="Compact"/>
+              <w:jc w:val="right"/>
+            </w:pPr>
+            <w:r>
+              <w:t xml:space="preserve">0.8973576</w:t>
+            </w:r>
+          </w:p>
+        </w:tc>
+      </w:tr>
+      <w:tr>
+        <w:tc>
+          <w:p>
+            <w:pPr>
+              <w:pStyle w:val="Compact"/>
+              <w:jc w:val="left"/>
+            </w:pPr>
+            <w:r>
+              <w:t xml:space="preserve">distance.from.sign</w:t>
+            </w:r>
+          </w:p>
+        </w:tc>
+        <w:tc>
+          <w:p>
+            <w:pPr>
+              <w:pStyle w:val="Compact"/>
+              <w:jc w:val="left"/>
+            </w:pPr>
+            <w:r>
+              <w:t xml:space="preserve">-0.038</w:t>
+            </w:r>
+          </w:p>
+        </w:tc>
+        <w:tc>
+          <w:p>
+            <w:pPr>
+              <w:pStyle w:val="Compact"/>
+              <w:jc w:val="left"/>
+            </w:pPr>
+            <w:r>
+              <w:t xml:space="preserve">0.099</w:t>
+            </w:r>
+          </w:p>
+        </w:tc>
+        <w:tc>
+          <w:p>
+            <w:pPr>
+              <w:pStyle w:val="Compact"/>
+              <w:jc w:val="left"/>
+            </w:pPr>
+            <w:r>
+              <w:t xml:space="preserve">-0.38</w:t>
+            </w:r>
+          </w:p>
+        </w:tc>
+        <w:tc>
+          <w:p>
+            <w:pPr>
+              <w:pStyle w:val="Compact"/>
+              <w:jc w:val="right"/>
+            </w:pPr>
+            <w:r>
+              <w:t xml:space="preserve">0.7039454</w:t>
+            </w:r>
+          </w:p>
+        </w:tc>
+      </w:tr>
+      <w:tr>
+        <w:tc>
+          <w:p>
+            <w:pPr>
+              <w:pStyle w:val="Compact"/>
+              <w:jc w:val="left"/>
+            </w:pPr>
+            <w:r>
+              <w:t xml:space="preserve">Vehicle Type Effects:</w:t>
+            </w:r>
+          </w:p>
+        </w:tc>
+        <w:tc>
+          <w:p>
+            <w:pStyle w:val="Compact"/>
+          </w:p>
+        </w:tc>
+        <w:tc>
+          <w:p>
+            <w:pStyle w:val="Compact"/>
+          </w:p>
+        </w:tc>
+        <w:tc>
+          <w:p>
+            <w:pStyle w:val="Compact"/>
+          </w:p>
+        </w:tc>
+        <w:tc>
+          <w:p>
+            <w:pPr>
+              <w:pStyle w:val="Compact"/>
+              <w:jc w:val="right"/>
+            </w:pPr>
+            <w:r>
+              <w:t xml:space="preserve">NA</w:t>
+            </w:r>
+          </w:p>
+        </w:tc>
+      </w:tr>
+      <w:tr>
+        <w:tc>
+          <w:p>
+            <w:pPr>
+              <w:pStyle w:val="Compact"/>
+              <w:jc w:val="left"/>
+            </w:pPr>
+            <w:r>
+              <w:t xml:space="preserve">Unspecified</w:t>
+            </w:r>
+          </w:p>
+        </w:tc>
+        <w:tc>
+          <w:p>
+            <w:pPr>
+              <w:pStyle w:val="Compact"/>
+              <w:jc w:val="left"/>
+            </w:pPr>
+            <w:r>
+              <w:t xml:space="preserve">-2.29</w:t>
+            </w:r>
+          </w:p>
+        </w:tc>
+        <w:tc>
+          <w:p>
+            <w:pPr>
+              <w:pStyle w:val="Compact"/>
+              <w:jc w:val="left"/>
+            </w:pPr>
+            <w:r>
+              <w:t xml:space="preserve">-0.01</w:t>
+            </w:r>
+          </w:p>
+        </w:tc>
+        <w:tc>
+          <w:p>
+            <w:pPr>
+              <w:pStyle w:val="Compact"/>
+              <w:jc w:val="left"/>
+            </w:pPr>
+            <w:r>
+              <w:t xml:space="preserve">-0.04</w:t>
+            </w:r>
+          </w:p>
+        </w:tc>
+        <w:tc>
+          <w:p>
+            <w:pPr>
+              <w:pStyle w:val="Compact"/>
+              <w:jc w:val="right"/>
+            </w:pPr>
+            <w:r>
+              <w:t xml:space="preserve">0.9680931</w:t>
+            </w:r>
+          </w:p>
+        </w:tc>
+      </w:tr>
+      <w:tr>
+        <w:tc>
+          <w:p>
+            <w:pPr>
+              <w:pStyle w:val="Compact"/>
+              <w:jc w:val="left"/>
+            </w:pPr>
+            <w:r>
+              <w:t xml:space="preserve">Car</w:t>
+            </w:r>
+          </w:p>
+        </w:tc>
+        <w:tc>
+          <w:p>
+            <w:pPr>
+              <w:pStyle w:val="Compact"/>
+              <w:jc w:val="left"/>
+            </w:pPr>
+            <w:r>
+              <w:t xml:space="preserve">-2.29</w:t>
+            </w:r>
+          </w:p>
+        </w:tc>
+        <w:tc>
+          <w:p>
+            <w:pPr>
+              <w:pStyle w:val="Compact"/>
+              <w:jc w:val="left"/>
+            </w:pPr>
+            <w:r>
+              <w:t xml:space="preserve">-0.01</w:t>
+            </w:r>
+          </w:p>
+        </w:tc>
+        <w:tc>
+          <w:p>
+            <w:pPr>
+              <w:pStyle w:val="Compact"/>
+              <w:jc w:val="left"/>
+            </w:pPr>
+            <w:r>
+              <w:t xml:space="preserve">-0.04</w:t>
+            </w:r>
+          </w:p>
+        </w:tc>
+        <w:tc>
+          <w:p>
+            <w:pPr>
+              <w:pStyle w:val="Compact"/>
+              <w:jc w:val="right"/>
+            </w:pPr>
+            <w:r>
+              <w:t xml:space="preserve">0.9680931</w:t>
+            </w:r>
+          </w:p>
+        </w:tc>
+      </w:tr>
+      <w:tr>
+        <w:tc>
+          <w:p>
+            <w:pPr>
+              <w:pStyle w:val="Compact"/>
+              <w:jc w:val="left"/>
+            </w:pPr>
+            <w:r>
+              <w:t xml:space="preserve">Truck</w:t>
+            </w:r>
+          </w:p>
+        </w:tc>
+        <w:tc>
+          <w:p>
+            <w:pPr>
+              <w:pStyle w:val="Compact"/>
+              <w:jc w:val="left"/>
+            </w:pPr>
+            <w:r>
+              <w:t xml:space="preserve">-2.29</w:t>
+            </w:r>
+          </w:p>
+        </w:tc>
+        <w:tc>
+          <w:p>
+            <w:pPr>
+              <w:pStyle w:val="Compact"/>
+              <w:jc w:val="left"/>
+            </w:pPr>
+            <w:r>
+              <w:t xml:space="preserve">-0.01</w:t>
+            </w:r>
+          </w:p>
+        </w:tc>
+        <w:tc>
+          <w:p>
+            <w:pPr>
+              <w:pStyle w:val="Compact"/>
+              <w:jc w:val="left"/>
+            </w:pPr>
+            <w:r>
+              <w:t xml:space="preserve">-0.04</w:t>
+            </w:r>
+          </w:p>
+        </w:tc>
+        <w:tc>
+          <w:p>
+            <w:pPr>
+              <w:pStyle w:val="Compact"/>
+              <w:jc w:val="right"/>
+            </w:pPr>
+            <w:r>
+              <w:t xml:space="preserve">0.9680931</w:t>
+            </w:r>
+          </w:p>
+        </w:tc>
+      </w:tr>
+      <w:tr>
+        <w:tc>
+          <w:p>
+            <w:pPr>
+              <w:pStyle w:val="Compact"/>
+              <w:jc w:val="left"/>
+            </w:pPr>
+            <w:r>
+              <w:t xml:space="preserve">Safety Focus Effects:</w:t>
+            </w:r>
+          </w:p>
+        </w:tc>
+        <w:tc>
+          <w:p>
+            <w:pStyle w:val="Compact"/>
+          </w:p>
+        </w:tc>
+        <w:tc>
+          <w:p>
+            <w:pStyle w:val="Compact"/>
+          </w:p>
+        </w:tc>
+        <w:tc>
+          <w:p>
+            <w:pStyle w:val="Compact"/>
+          </w:p>
+        </w:tc>
+        <w:tc>
+          <w:p>
+            <w:pPr>
+              <w:pStyle w:val="Compact"/>
+              <w:jc w:val="right"/>
+            </w:pPr>
+            <w:r>
+              <w:t xml:space="preserve">NA</w:t>
+            </w:r>
+          </w:p>
+        </w:tc>
+      </w:tr>
+      <w:tr>
+        <w:tc>
+          <w:p>
+            <w:pPr>
+              <w:pStyle w:val="Compact"/>
+              <w:jc w:val="left"/>
+            </w:pPr>
+            <w:r>
+              <w:t xml:space="preserve">Unspecified</w:t>
+            </w:r>
+          </w:p>
+        </w:tc>
+        <w:tc>
+          <w:p>
+            <w:pPr>
+              <w:pStyle w:val="Compact"/>
+              <w:jc w:val="left"/>
+            </w:pPr>
+            <w:r>
+              <w:t xml:space="preserve">-2.72</w:t>
+            </w:r>
+          </w:p>
+        </w:tc>
+        <w:tc>
+          <w:p>
+            <w:pPr>
+              <w:pStyle w:val="Compact"/>
+              <w:jc w:val="left"/>
+            </w:pPr>
+            <w:r>
+              <w:t xml:space="preserve">-0.01</w:t>
+            </w:r>
+          </w:p>
+        </w:tc>
+        <w:tc>
+          <w:p>
+            <w:pPr>
+              <w:pStyle w:val="Compact"/>
+              <w:jc w:val="left"/>
+            </w:pPr>
+            <w:r>
+              <w:t xml:space="preserve">-0.04</w:t>
+            </w:r>
+          </w:p>
+        </w:tc>
+        <w:tc>
+          <w:p>
+            <w:pPr>
+              <w:pStyle w:val="Compact"/>
+              <w:jc w:val="right"/>
+            </w:pPr>
+            <w:r>
+              <w:t xml:space="preserve">0.9680931</w:t>
+            </w:r>
+          </w:p>
+        </w:tc>
+      </w:tr>
+      <w:tr>
+        <w:tc>
+          <w:p>
+            <w:pPr>
+              <w:pStyle w:val="Compact"/>
+              <w:jc w:val="left"/>
+            </w:pPr>
+            <w:r>
+              <w:t xml:space="preserve">Curved Section</w:t>
+            </w:r>
+          </w:p>
+        </w:tc>
+        <w:tc>
+          <w:p>
+            <w:pPr>
+              <w:pStyle w:val="Compact"/>
+              <w:jc w:val="left"/>
+            </w:pPr>
+            <w:r>
+              <w:t xml:space="preserve">-1.37</w:t>
+            </w:r>
+          </w:p>
+        </w:tc>
+        <w:tc>
+          <w:p>
+            <w:pPr>
+              <w:pStyle w:val="Compact"/>
+              <w:jc w:val="left"/>
+            </w:pPr>
+            <w:r>
+              <w:t xml:space="preserve">-0.01</w:t>
+            </w:r>
+          </w:p>
+        </w:tc>
+        <w:tc>
+          <w:p>
+            <w:pPr>
+              <w:pStyle w:val="Compact"/>
+              <w:jc w:val="left"/>
+            </w:pPr>
+            <w:r>
+              <w:t xml:space="preserve">-0.04</w:t>
+            </w:r>
+          </w:p>
+        </w:tc>
+        <w:tc>
+          <w:p>
+            <w:pPr>
+              <w:pStyle w:val="Compact"/>
+              <w:jc w:val="right"/>
+            </w:pPr>
+            <w:r>
+              <w:t xml:space="preserve">0.9680931</w:t>
+            </w:r>
+          </w:p>
+        </w:tc>
+      </w:tr>
+      <w:tr>
+        <w:tc>
+          <w:p>
+            <w:pPr>
+              <w:pStyle w:val="Compact"/>
+              <w:jc w:val="left"/>
+            </w:pPr>
+            <w:r>
+              <w:t xml:space="preserve">School Zone</w:t>
+            </w:r>
+          </w:p>
+        </w:tc>
+        <w:tc>
+          <w:p>
+            <w:pPr>
+              <w:pStyle w:val="Compact"/>
+              <w:jc w:val="left"/>
+            </w:pPr>
+            <w:r>
+              <w:t xml:space="preserve">-2.73</w:t>
+            </w:r>
+          </w:p>
+        </w:tc>
+        <w:tc>
+          <w:p>
+            <w:pPr>
+              <w:pStyle w:val="Compact"/>
+              <w:jc w:val="left"/>
+            </w:pPr>
+            <w:r>
+              <w:t xml:space="preserve">-0.01</w:t>
+            </w:r>
+          </w:p>
+        </w:tc>
+        <w:tc>
+          <w:p>
+            <w:pPr>
+              <w:pStyle w:val="Compact"/>
+              <w:jc w:val="left"/>
+            </w:pPr>
+            <w:r>
+              <w:t xml:space="preserve">-0.04</w:t>
+            </w:r>
+          </w:p>
+        </w:tc>
+        <w:tc>
+          <w:p>
+            <w:pPr>
+              <w:pStyle w:val="Compact"/>
+              <w:jc w:val="right"/>
+            </w:pPr>
+            <w:r>
+              <w:t xml:space="preserve">0.9680931</w:t>
+            </w:r>
+          </w:p>
+        </w:tc>
+      </w:tr>
+      <w:tr>
+        <w:tc>
+          <w:p>
+            <w:pPr>
+              <w:pStyle w:val="Compact"/>
+              <w:jc w:val="left"/>
+            </w:pPr>
+            <w:r>
+              <w:t xml:space="preserve">Signalized Interserction</w:t>
+            </w:r>
+          </w:p>
+        </w:tc>
+        <w:tc>
+          <w:p>
+            <w:pPr>
+              <w:pStyle w:val="Compact"/>
+              <w:jc w:val="left"/>
+            </w:pPr>
+            <w:r>
+              <w:t xml:space="preserve">-2.32</w:t>
+            </w:r>
+          </w:p>
+        </w:tc>
+        <w:tc>
+          <w:p>
+            <w:pPr>
+              <w:pStyle w:val="Compact"/>
+              <w:jc w:val="left"/>
+            </w:pPr>
+            <w:r>
+              <w:t xml:space="preserve">-0.01</w:t>
+            </w:r>
+          </w:p>
+        </w:tc>
+        <w:tc>
+          <w:p>
+            <w:pPr>
+              <w:pStyle w:val="Compact"/>
+              <w:jc w:val="left"/>
+            </w:pPr>
+            <w:r>
+              <w:t xml:space="preserve">-0.04</w:t>
+            </w:r>
+          </w:p>
+        </w:tc>
+        <w:tc>
+          <w:p>
+            <w:pPr>
+              <w:pStyle w:val="Compact"/>
+              <w:jc w:val="right"/>
+            </w:pPr>
+            <w:r>
+              <w:t xml:space="preserve">0.9680931</w:t>
+            </w:r>
+          </w:p>
+        </w:tc>
+      </w:tr>
+      <w:tr>
+        <w:tc>
+          <w:p>
+            <w:pPr>
+              <w:pStyle w:val="Compact"/>
+              <w:jc w:val="left"/>
+            </w:pPr>
+            <w:r>
+              <w:t xml:space="preserve">Transition Zone</w:t>
+            </w:r>
+          </w:p>
+        </w:tc>
+        <w:tc>
+          <w:p>
+            <w:pPr>
+              <w:pStyle w:val="Compact"/>
+              <w:jc w:val="left"/>
+            </w:pPr>
+            <w:r>
+              <w:t xml:space="preserve">-2.18</w:t>
+            </w:r>
+          </w:p>
+        </w:tc>
+        <w:tc>
+          <w:p>
+            <w:pPr>
+              <w:pStyle w:val="Compact"/>
+              <w:jc w:val="left"/>
+            </w:pPr>
+            <w:r>
+              <w:t xml:space="preserve">-0.01</w:t>
+            </w:r>
+          </w:p>
+        </w:tc>
+        <w:tc>
+          <w:p>
+            <w:pPr>
+              <w:pStyle w:val="Compact"/>
+              <w:jc w:val="left"/>
+            </w:pPr>
+            <w:r>
+              <w:t xml:space="preserve">-0.04</w:t>
+            </w:r>
+          </w:p>
+        </w:tc>
+        <w:tc>
+          <w:p>
+            <w:pPr>
+              <w:pStyle w:val="Compact"/>
+              <w:jc w:val="right"/>
+            </w:pPr>
+            <w:r>
+              <w:t xml:space="preserve">0.9680931</w:t>
+            </w:r>
+          </w:p>
+        </w:tc>
+      </w:tr>
+      <w:tr>
+        <w:tc>
+          <w:p>
+            <w:pPr>
+              <w:pStyle w:val="Compact"/>
+              <w:jc w:val="left"/>
+            </w:pPr>
+            <w:r>
+              <w:t xml:space="preserve">Work Zone</w:t>
+            </w:r>
+          </w:p>
+        </w:tc>
+        <w:tc>
+          <w:p>
+            <w:pPr>
+              <w:pStyle w:val="Compact"/>
+              <w:jc w:val="left"/>
+            </w:pPr>
+            <w:r>
+              <w:t xml:space="preserve">-2.41</w:t>
+            </w:r>
+          </w:p>
+        </w:tc>
+        <w:tc>
+          <w:p>
+            <w:pPr>
+              <w:pStyle w:val="Compact"/>
+              <w:jc w:val="left"/>
+            </w:pPr>
+            <w:r>
+              <w:t xml:space="preserve">-0.01</w:t>
+            </w:r>
+          </w:p>
+        </w:tc>
+        <w:tc>
+          <w:p>
+            <w:pPr>
+              <w:pStyle w:val="Compact"/>
+              <w:jc w:val="left"/>
+            </w:pPr>
+            <w:r>
+              <w:t xml:space="preserve">-0.04</w:t>
+            </w:r>
+          </w:p>
+        </w:tc>
+        <w:tc>
+          <w:p>
+            <w:pPr>
+              <w:pStyle w:val="Compact"/>
+              <w:jc w:val="right"/>
+            </w:pPr>
+            <w:r>
+              <w:t xml:space="preserve">0.9680931</w:t>
+            </w:r>
+          </w:p>
+        </w:tc>
+      </w:tr>
+    </w:tbl>
+    <w:p>
+      <w:pPr>
         <w:pStyle w:val="Heading3"/>
       </w:pPr>
-      <w:bookmarkStart w:id="32" w:name="h1b-activation-at-site-of-dsfs"/>
-      <w:bookmarkEnd w:id="32"/>
+      <w:bookmarkStart w:id="31" w:name="h1b-activation-at-site-of-dsfs"/>
+      <w:bookmarkEnd w:id="31"/>
       <w:r>
         <w:t xml:space="preserve">H1B: Activation at site of DSFS</w:t>
       </w:r>
@@ -5164,7 +6003,7 @@
               <w:jc w:val="left"/>
             </w:pPr>
             <w:r>
-              <w:t xml:space="preserve">-3.72</w:t>
+              <w:t xml:space="preserve">-1.08</w:t>
             </w:r>
           </w:p>
         </w:tc>
@@ -5198,7 +6037,7 @@
               <w:jc w:val="left"/>
             </w:pPr>
             <w:r>
-              <w:t xml:space="preserve">-4.14</w:t>
+              <w:t xml:space="preserve">-1.14</w:t>
             </w:r>
           </w:p>
         </w:tc>
@@ -5232,7 +6071,359 @@
               <w:jc w:val="left"/>
             </w:pPr>
             <w:r>
-              <w:t xml:space="preserve">-2.83</w:t>
+              <w:t xml:space="preserve">0.63</w:t>
+            </w:r>
+          </w:p>
+        </w:tc>
+        <w:tc>
+          <w:p>
+            <w:pStyle w:val="Compact"/>
+          </w:p>
+        </w:tc>
+        <w:tc>
+          <w:p>
+            <w:pStyle w:val="Compact"/>
+          </w:p>
+        </w:tc>
+      </w:tr>
+    </w:tbl>
+    <w:p>
+      <w:pPr>
+        <w:pStyle w:val="TableCaption"/>
+      </w:pPr>
+      <w:r>
+        <w:t xml:space="preserve">Summary of mixed effect model of hypothesis H1B, difference in speeds betwen DSFS before and at time of activation, with posted speed and distance.</w:t>
+      </w:r>
+    </w:p>
+    <w:tbl>
+      <w:tblPr>
+        <w:tblStyle w:val="TableNormal"/>
+        <w:tblW w:type="pct" w:w="0.0"/>
+        <w:tblLook w:firstRow="1"/>
+        <w:tblCaption w:val="Summary of mixed effect model of hypothesis H1B, difference in speeds betwen DSFS before and at time of activation, with posted speed and distance."/>
+      </w:tblPr>
+      <w:tblGrid/>
+      <w:tr>
+        <w:trPr>
+          <w:cnfStyle w:firstRow="1"/>
+        </w:trPr>
+        <w:tc>
+          <w:tcPr>
+            <w:tcBorders>
+              <w:bottom w:val="single"/>
+            </w:tcBorders>
+            <w:vAlign w:val="bottom"/>
+          </w:tcPr>
+          <w:p>
+            <w:pStyle w:val="Compact"/>
+          </w:p>
+        </w:tc>
+        <w:tc>
+          <w:tcPr>
+            <w:tcBorders>
+              <w:bottom w:val="single"/>
+            </w:tcBorders>
+            <w:vAlign w:val="bottom"/>
+          </w:tcPr>
+          <w:p>
+            <w:pPr>
+              <w:pStyle w:val="Compact"/>
+              <w:jc w:val="left"/>
+            </w:pPr>
+            <w:r>
+              <w:t xml:space="preserve">Estimate</w:t>
+            </w:r>
+          </w:p>
+        </w:tc>
+        <w:tc>
+          <w:tcPr>
+            <w:tcBorders>
+              <w:bottom w:val="single"/>
+            </w:tcBorders>
+            <w:vAlign w:val="bottom"/>
+          </w:tcPr>
+          <w:p>
+            <w:pPr>
+              <w:pStyle w:val="Compact"/>
+              <w:jc w:val="left"/>
+            </w:pPr>
+            <w:r>
+              <w:t xml:space="preserve">Std. Error</w:t>
+            </w:r>
+          </w:p>
+        </w:tc>
+        <w:tc>
+          <w:tcPr>
+            <w:tcBorders>
+              <w:bottom w:val="single"/>
+            </w:tcBorders>
+            <w:vAlign w:val="bottom"/>
+          </w:tcPr>
+          <w:p>
+            <w:pPr>
+              <w:pStyle w:val="Compact"/>
+              <w:jc w:val="left"/>
+            </w:pPr>
+            <w:r>
+              <w:t xml:space="preserve">t value</w:t>
+            </w:r>
+          </w:p>
+        </w:tc>
+      </w:tr>
+      <w:tr>
+        <w:tc>
+          <w:p>
+            <w:pPr>
+              <w:pStyle w:val="Compact"/>
+              <w:jc w:val="left"/>
+            </w:pPr>
+            <w:r>
+              <w:t xml:space="preserve">Overall Effect</w:t>
+            </w:r>
+          </w:p>
+        </w:tc>
+        <w:tc>
+          <w:p>
+            <w:pPr>
+              <w:pStyle w:val="Compact"/>
+              <w:jc w:val="left"/>
+            </w:pPr>
+            <w:r>
+              <w:t xml:space="preserve">-3.12</w:t>
+            </w:r>
+          </w:p>
+        </w:tc>
+        <w:tc>
+          <w:p>
+            <w:pPr>
+              <w:pStyle w:val="Compact"/>
+              <w:jc w:val="left"/>
+            </w:pPr>
+            <w:r>
+              <w:t xml:space="preserve">1.058</w:t>
+            </w:r>
+          </w:p>
+        </w:tc>
+        <w:tc>
+          <w:p>
+            <w:pPr>
+              <w:pStyle w:val="Compact"/>
+              <w:jc w:val="left"/>
+            </w:pPr>
+            <w:r>
+              <w:t xml:space="preserve">-2.948</w:t>
+            </w:r>
+          </w:p>
+        </w:tc>
+      </w:tr>
+      <w:tr>
+        <w:tc>
+          <w:p>
+            <w:pPr>
+              <w:pStyle w:val="Compact"/>
+              <w:jc w:val="left"/>
+            </w:pPr>
+            <w:r>
+              <w:t xml:space="preserve">posted.speed</w:t>
+            </w:r>
+          </w:p>
+        </w:tc>
+        <w:tc>
+          <w:p>
+            <w:pPr>
+              <w:pStyle w:val="Compact"/>
+              <w:jc w:val="left"/>
+            </w:pPr>
+            <w:r>
+              <w:t xml:space="preserve">0.016</w:t>
+            </w:r>
+          </w:p>
+        </w:tc>
+        <w:tc>
+          <w:p>
+            <w:pPr>
+              <w:pStyle w:val="Compact"/>
+              <w:jc w:val="left"/>
+            </w:pPr>
+            <w:r>
+              <w:t xml:space="preserve">0.021</w:t>
+            </w:r>
+          </w:p>
+        </w:tc>
+        <w:tc>
+          <w:p>
+            <w:pPr>
+              <w:pStyle w:val="Compact"/>
+              <w:jc w:val="left"/>
+            </w:pPr>
+            <w:r>
+              <w:t xml:space="preserve">0.77</w:t>
+            </w:r>
+          </w:p>
+        </w:tc>
+      </w:tr>
+      <w:tr>
+        <w:tc>
+          <w:p>
+            <w:pPr>
+              <w:pStyle w:val="Compact"/>
+              <w:jc w:val="left"/>
+            </w:pPr>
+            <w:r>
+              <w:t xml:space="preserve">distance.from.sign</w:t>
+            </w:r>
+          </w:p>
+        </w:tc>
+        <w:tc>
+          <w:p>
+            <w:pPr>
+              <w:pStyle w:val="Compact"/>
+              <w:jc w:val="left"/>
+            </w:pPr>
+            <w:r>
+              <w:t xml:space="preserve">0.015</w:t>
+            </w:r>
+          </w:p>
+        </w:tc>
+        <w:tc>
+          <w:p>
+            <w:pPr>
+              <w:pStyle w:val="Compact"/>
+              <w:jc w:val="left"/>
+            </w:pPr>
+            <w:r>
+              <w:t xml:space="preserve">0.016</w:t>
+            </w:r>
+          </w:p>
+        </w:tc>
+        <w:tc>
+          <w:p>
+            <w:pPr>
+              <w:pStyle w:val="Compact"/>
+              <w:jc w:val="left"/>
+            </w:pPr>
+            <w:r>
+              <w:t xml:space="preserve">0.994</w:t>
+            </w:r>
+          </w:p>
+        </w:tc>
+      </w:tr>
+      <w:tr>
+        <w:tc>
+          <w:p>
+            <w:pPr>
+              <w:pStyle w:val="Compact"/>
+              <w:jc w:val="left"/>
+            </w:pPr>
+            <w:r>
+              <w:t xml:space="preserve">Vehicle Type Effects:</w:t>
+            </w:r>
+          </w:p>
+        </w:tc>
+        <w:tc>
+          <w:p>
+            <w:pStyle w:val="Compact"/>
+          </w:p>
+        </w:tc>
+        <w:tc>
+          <w:p>
+            <w:pStyle w:val="Compact"/>
+          </w:p>
+        </w:tc>
+        <w:tc>
+          <w:p>
+            <w:pStyle w:val="Compact"/>
+          </w:p>
+        </w:tc>
+      </w:tr>
+      <w:tr>
+        <w:tc>
+          <w:p>
+            <w:pPr>
+              <w:pStyle w:val="Compact"/>
+              <w:jc w:val="left"/>
+            </w:pPr>
+            <w:r>
+              <w:t xml:space="preserve">Unspecified</w:t>
+            </w:r>
+          </w:p>
+        </w:tc>
+        <w:tc>
+          <w:p>
+            <w:pPr>
+              <w:pStyle w:val="Compact"/>
+              <w:jc w:val="left"/>
+            </w:pPr>
+            <w:r>
+              <w:t xml:space="preserve">-3.2</w:t>
+            </w:r>
+          </w:p>
+        </w:tc>
+        <w:tc>
+          <w:p>
+            <w:pStyle w:val="Compact"/>
+          </w:p>
+        </w:tc>
+        <w:tc>
+          <w:p>
+            <w:pStyle w:val="Compact"/>
+          </w:p>
+        </w:tc>
+      </w:tr>
+      <w:tr>
+        <w:tc>
+          <w:p>
+            <w:pPr>
+              <w:pStyle w:val="Compact"/>
+              <w:jc w:val="left"/>
+            </w:pPr>
+            <w:r>
+              <w:t xml:space="preserve">Car</w:t>
+            </w:r>
+          </w:p>
+        </w:tc>
+        <w:tc>
+          <w:p>
+            <w:pPr>
+              <w:pStyle w:val="Compact"/>
+              <w:jc w:val="left"/>
+            </w:pPr>
+            <w:r>
+              <w:t xml:space="preserve">-3.62</w:t>
+            </w:r>
+          </w:p>
+        </w:tc>
+        <w:tc>
+          <w:p>
+            <w:pStyle w:val="Compact"/>
+          </w:p>
+        </w:tc>
+        <w:tc>
+          <w:p>
+            <w:pStyle w:val="Compact"/>
+          </w:p>
+        </w:tc>
+      </w:tr>
+      <w:tr>
+        <w:tc>
+          <w:p>
+            <w:pPr>
+              <w:pStyle w:val="Compact"/>
+              <w:jc w:val="left"/>
+            </w:pPr>
+            <w:r>
+              <w:t xml:space="preserve">Truck</w:t>
+            </w:r>
+          </w:p>
+        </w:tc>
+        <w:tc>
+          <w:p>
+            <w:pPr>
+              <w:pStyle w:val="Compact"/>
+              <w:jc w:val="left"/>
+            </w:pPr>
+            <w:r>
+              <w:t xml:space="preserve">-2.53</w:t>
             </w:r>
           </w:p>
         </w:tc>
@@ -5270,7 +6461,49 @@
               <a:graphicData uri="http://schemas.openxmlformats.org/drawingml/2006/picture">
                 <pic:pic>
                   <pic:nvPicPr>
-                    <pic:cNvPr descr="MA_Article_files/figure-docx/unnamed-chunk-5-1.png" id="0" name="Picture"/>
+                    <pic:cNvPr descr="MA_Article_files/figure-docx/unnamed-chunk-6-1.png" id="0" name="Picture"/>
+                    <pic:cNvPicPr>
+                      <a:picLocks noChangeArrowheads="1" noChangeAspect="1"/>
+                    </pic:cNvPicPr>
+                  </pic:nvPicPr>
+                  <pic:blipFill>
+                    <a:blip r:embed="rId32"/>
+                    <a:stretch>
+                      <a:fillRect/>
+                    </a:stretch>
+                  </pic:blipFill>
+                  <pic:spPr bwMode="auto">
+                    <a:xfrm>
+                      <a:off x="0" y="0"/>
+                      <a:ext cx="3696101" cy="2772075"/>
+                    </a:xfrm>
+                    <a:prstGeom prst="rect">
+                      <a:avLst/>
+                    </a:prstGeom>
+                    <a:noFill/>
+                    <a:ln w="9525">
+                      <a:noFill/>
+                      <a:headEnd/>
+                      <a:tailEnd/>
+                    </a:ln>
+                  </pic:spPr>
+                </pic:pic>
+              </a:graphicData>
+            </a:graphic>
+          </wp:inline>
+        </w:drawing>
+      </w:r>
+      <w:r>
+        <w:drawing>
+          <wp:inline>
+            <wp:extent cx="3696101" cy="2772075"/>
+            <wp:effectExtent b="0" l="0" r="0" t="0"/>
+            <wp:docPr descr="Plot of effect sizes for hypothesis H1B, effect of DSFS adjacent to sign site, for the grouping levels of vehicle type and publication ID." id="1" name="Picture"/>
+            <a:graphic>
+              <a:graphicData uri="http://schemas.openxmlformats.org/drawingml/2006/picture">
+                <pic:pic>
+                  <pic:nvPicPr>
+                    <pic:cNvPr descr="MA_Article_files/figure-docx/unnamed-chunk-6-2.png" id="0" name="Picture"/>
                     <pic:cNvPicPr>
                       <a:picLocks noChangeArrowheads="1" noChangeAspect="1"/>
                     </pic:cNvPicPr>
@@ -5302,55 +6535,13 @@
           </wp:inline>
         </w:drawing>
       </w:r>
-      <w:r>
-        <w:drawing>
-          <wp:inline>
-            <wp:extent cx="3696101" cy="2772075"/>
-            <wp:effectExtent b="0" l="0" r="0" t="0"/>
-            <wp:docPr descr="Plot of effect sizes for hypothesis H1B, effect of DSFS adjacent to sign site, for the grouping levels of vehicle type and publication ID." id="1" name="Picture"/>
-            <a:graphic>
-              <a:graphicData uri="http://schemas.openxmlformats.org/drawingml/2006/picture">
-                <pic:pic>
-                  <pic:nvPicPr>
-                    <pic:cNvPr descr="MA_Article_files/figure-docx/unnamed-chunk-5-2.png" id="0" name="Picture"/>
-                    <pic:cNvPicPr>
-                      <a:picLocks noChangeArrowheads="1" noChangeAspect="1"/>
-                    </pic:cNvPicPr>
-                  </pic:nvPicPr>
-                  <pic:blipFill>
-                    <a:blip r:embed="rId34"/>
-                    <a:stretch>
-                      <a:fillRect/>
-                    </a:stretch>
-                  </pic:blipFill>
-                  <pic:spPr bwMode="auto">
-                    <a:xfrm>
-                      <a:off x="0" y="0"/>
-                      <a:ext cx="3696101" cy="2772075"/>
-                    </a:xfrm>
-                    <a:prstGeom prst="rect">
-                      <a:avLst/>
-                    </a:prstGeom>
-                    <a:noFill/>
-                    <a:ln w="9525">
-                      <a:noFill/>
-                      <a:headEnd/>
-                      <a:tailEnd/>
-                    </a:ln>
-                  </pic:spPr>
-                </pic:pic>
-              </a:graphicData>
-            </a:graphic>
-          </wp:inline>
-        </w:drawing>
-      </w:r>
     </w:p>
     <w:p>
       <w:pPr>
         <w:pStyle w:val="Heading3"/>
       </w:pPr>
-      <w:bookmarkStart w:id="35" w:name="h1c-activation-effect-upstream-and-adjacent"/>
-      <w:bookmarkEnd w:id="35"/>
+      <w:bookmarkStart w:id="34" w:name="h1c-activation-effect-upstream-and-adjacent"/>
+      <w:bookmarkEnd w:id="34"/>
       <w:r>
         <w:t xml:space="preserve">H1C: Activation effect upstream and adjacent</w:t>
       </w:r>
@@ -5929,10 +7120,186 @@
     </w:tbl>
     <w:p>
       <w:pPr>
+        <w:pStyle w:val="TableCaption"/>
+      </w:pPr>
+      <w:r>
+        <w:t xml:space="preserve">Summary of mixed effect model of hypothesis H1B, difference in speeds betwen DSFS before and at time of activation, with posted speed and distance, with posted speed.</w:t>
+      </w:r>
+    </w:p>
+    <w:tbl>
+      <w:tblPr>
+        <w:tblStyle w:val="TableNormal"/>
+        <w:tblW w:type="pct" w:w="0.0"/>
+        <w:tblLook w:firstRow="1"/>
+        <w:tblCaption w:val="Summary of mixed effect model of hypothesis H1B, difference in speeds betwen DSFS before and at time of activation, with posted speed and distance, with posted speed."/>
+      </w:tblPr>
+      <w:tblGrid/>
+      <w:tr>
+        <w:trPr>
+          <w:cnfStyle w:firstRow="1"/>
+        </w:trPr>
+        <w:tc>
+          <w:tcPr>
+            <w:tcBorders>
+              <w:bottom w:val="single"/>
+            </w:tcBorders>
+            <w:vAlign w:val="bottom"/>
+          </w:tcPr>
+          <w:p>
+            <w:pStyle w:val="Compact"/>
+          </w:p>
+        </w:tc>
+        <w:tc>
+          <w:tcPr>
+            <w:tcBorders>
+              <w:bottom w:val="single"/>
+            </w:tcBorders>
+            <w:vAlign w:val="bottom"/>
+          </w:tcPr>
+          <w:p>
+            <w:pPr>
+              <w:pStyle w:val="Compact"/>
+              <w:jc w:val="right"/>
+            </w:pPr>
+            <w:r>
+              <w:t xml:space="preserve">Estimate</w:t>
+            </w:r>
+          </w:p>
+        </w:tc>
+        <w:tc>
+          <w:tcPr>
+            <w:tcBorders>
+              <w:bottom w:val="single"/>
+            </w:tcBorders>
+            <w:vAlign w:val="bottom"/>
+          </w:tcPr>
+          <w:p>
+            <w:pPr>
+              <w:pStyle w:val="Compact"/>
+              <w:jc w:val="right"/>
+            </w:pPr>
+            <w:r>
+              <w:t xml:space="preserve">Std. Error</w:t>
+            </w:r>
+          </w:p>
+        </w:tc>
+        <w:tc>
+          <w:tcPr>
+            <w:tcBorders>
+              <w:bottom w:val="single"/>
+            </w:tcBorders>
+            <w:vAlign w:val="bottom"/>
+          </w:tcPr>
+          <w:p>
+            <w:pPr>
+              <w:pStyle w:val="Compact"/>
+              <w:jc w:val="right"/>
+            </w:pPr>
+            <w:r>
+              <w:t xml:space="preserve">t value</w:t>
+            </w:r>
+          </w:p>
+        </w:tc>
+      </w:tr>
+      <w:tr>
+        <w:tc>
+          <w:p>
+            <w:pPr>
+              <w:pStyle w:val="Compact"/>
+              <w:jc w:val="left"/>
+            </w:pPr>
+            <w:r>
+              <w:t xml:space="preserve">Overall Effect</w:t>
+            </w:r>
+          </w:p>
+        </w:tc>
+        <w:tc>
+          <w:p>
+            <w:pPr>
+              <w:pStyle w:val="Compact"/>
+              <w:jc w:val="right"/>
+            </w:pPr>
+            <w:r>
+              <w:t xml:space="preserve">9.679</w:t>
+            </w:r>
+          </w:p>
+        </w:tc>
+        <w:tc>
+          <w:p>
+            <w:pPr>
+              <w:pStyle w:val="Compact"/>
+              <w:jc w:val="right"/>
+            </w:pPr>
+            <w:r>
+              <w:t xml:space="preserve">15.425</w:t>
+            </w:r>
+          </w:p>
+        </w:tc>
+        <w:tc>
+          <w:p>
+            <w:pPr>
+              <w:pStyle w:val="Compact"/>
+              <w:jc w:val="right"/>
+            </w:pPr>
+            <w:r>
+              <w:t xml:space="preserve">0.627</w:t>
+            </w:r>
+          </w:p>
+        </w:tc>
+      </w:tr>
+      <w:tr>
+        <w:tc>
+          <w:p>
+            <w:pPr>
+              <w:pStyle w:val="Compact"/>
+              <w:jc w:val="left"/>
+            </w:pPr>
+            <w:r>
+              <w:t xml:space="preserve">posted.speed</w:t>
+            </w:r>
+          </w:p>
+        </w:tc>
+        <w:tc>
+          <w:p>
+            <w:pPr>
+              <w:pStyle w:val="Compact"/>
+              <w:jc w:val="right"/>
+            </w:pPr>
+            <w:r>
+              <w:t xml:space="preserve">-0.338</w:t>
+            </w:r>
+          </w:p>
+        </w:tc>
+        <w:tc>
+          <w:p>
+            <w:pPr>
+              <w:pStyle w:val="Compact"/>
+              <w:jc w:val="right"/>
+            </w:pPr>
+            <w:r>
+              <w:t xml:space="preserve">0.280</w:t>
+            </w:r>
+          </w:p>
+        </w:tc>
+        <w:tc>
+          <w:p>
+            <w:pPr>
+              <w:pStyle w:val="Compact"/>
+              <w:jc w:val="right"/>
+            </w:pPr>
+            <w:r>
+              <w:t xml:space="preserve">-1.209</w:t>
+            </w:r>
+          </w:p>
+        </w:tc>
+      </w:tr>
+    </w:tbl>
+    <w:p>
+      <w:pPr>
         <w:pStyle w:val="Heading2"/>
       </w:pPr>
-      <w:bookmarkStart w:id="36" w:name="h2-downstream-hypothesis"/>
-      <w:bookmarkEnd w:id="36"/>
+      <w:bookmarkStart w:id="35" w:name="h2-downstream-hypothesis"/>
+      <w:bookmarkEnd w:id="35"/>
       <w:r>
         <w:t xml:space="preserve">H2: Downstream Hypothesis</w:t>
       </w:r>
@@ -5957,8 +7324,8 @@
       <w:pPr>
         <w:pStyle w:val="Heading3"/>
       </w:pPr>
-      <w:bookmarkStart w:id="37" w:name="h2a"/>
-      <w:bookmarkEnd w:id="37"/>
+      <w:bookmarkStart w:id="36" w:name="h2a"/>
+      <w:bookmarkEnd w:id="36"/>
       <w:r>
         <w:t xml:space="preserve">H2A</w:t>
       </w:r>
@@ -6469,10 +7836,270 @@
     </w:tbl>
     <w:p>
       <w:pPr>
+        <w:pStyle w:val="TableCaption"/>
+      </w:pPr>
+      <w:r>
+        <w:t xml:space="preserve">Table 11. Summary of mixed effect model of hypothesis H2A</w:t>
+      </w:r>
+    </w:p>
+    <w:tbl>
+      <w:tblPr>
+        <w:tblStyle w:val="TableNormal"/>
+        <w:tblW w:type="pct" w:w="0.0"/>
+        <w:tblLook w:firstRow="1"/>
+        <w:tblCaption w:val="Table 11. Summary of mixed effect model of hypothesis H2A"/>
+      </w:tblPr>
+      <w:tblGrid/>
+      <w:tr>
+        <w:trPr>
+          <w:cnfStyle w:firstRow="1"/>
+        </w:trPr>
+        <w:tc>
+          <w:tcPr>
+            <w:tcBorders>
+              <w:bottom w:val="single"/>
+            </w:tcBorders>
+            <w:vAlign w:val="bottom"/>
+          </w:tcPr>
+          <w:p>
+            <w:pStyle w:val="Compact"/>
+          </w:p>
+        </w:tc>
+        <w:tc>
+          <w:tcPr>
+            <w:tcBorders>
+              <w:bottom w:val="single"/>
+            </w:tcBorders>
+            <w:vAlign w:val="bottom"/>
+          </w:tcPr>
+          <w:p>
+            <w:pPr>
+              <w:pStyle w:val="Compact"/>
+              <w:jc w:val="left"/>
+            </w:pPr>
+            <w:r>
+              <w:t xml:space="preserve">Estimate</w:t>
+            </w:r>
+          </w:p>
+        </w:tc>
+        <w:tc>
+          <w:tcPr>
+            <w:tcBorders>
+              <w:bottom w:val="single"/>
+            </w:tcBorders>
+            <w:vAlign w:val="bottom"/>
+          </w:tcPr>
+          <w:p>
+            <w:pPr>
+              <w:pStyle w:val="Compact"/>
+              <w:jc w:val="left"/>
+            </w:pPr>
+            <w:r>
+              <w:t xml:space="preserve">Std. Error</w:t>
+            </w:r>
+          </w:p>
+        </w:tc>
+        <w:tc>
+          <w:tcPr>
+            <w:tcBorders>
+              <w:bottom w:val="single"/>
+            </w:tcBorders>
+            <w:vAlign w:val="bottom"/>
+          </w:tcPr>
+          <w:p>
+            <w:pPr>
+              <w:pStyle w:val="Compact"/>
+              <w:jc w:val="left"/>
+            </w:pPr>
+            <w:r>
+              <w:t xml:space="preserve">t value</w:t>
+            </w:r>
+          </w:p>
+        </w:tc>
+      </w:tr>
+      <w:tr>
+        <w:tc>
+          <w:p>
+            <w:pPr>
+              <w:pStyle w:val="Compact"/>
+              <w:jc w:val="left"/>
+            </w:pPr>
+            <w:r>
+              <w:t xml:space="preserve">Overall Effect</w:t>
+            </w:r>
+          </w:p>
+        </w:tc>
+        <w:tc>
+          <w:p>
+            <w:pPr>
+              <w:pStyle w:val="Compact"/>
+              <w:jc w:val="left"/>
+            </w:pPr>
+            <w:r>
+              <w:t xml:space="preserve">-0.942</w:t>
+            </w:r>
+          </w:p>
+        </w:tc>
+        <w:tc>
+          <w:p>
+            <w:pPr>
+              <w:pStyle w:val="Compact"/>
+              <w:jc w:val="left"/>
+            </w:pPr>
+            <w:r>
+              <w:t xml:space="preserve">0.652</w:t>
+            </w:r>
+          </w:p>
+        </w:tc>
+        <w:tc>
+          <w:p>
+            <w:pPr>
+              <w:pStyle w:val="Compact"/>
+              <w:jc w:val="left"/>
+            </w:pPr>
+            <w:r>
+              <w:t xml:space="preserve">-1.445</w:t>
+            </w:r>
+          </w:p>
+        </w:tc>
+      </w:tr>
+      <w:tr>
+        <w:tc>
+          <w:p>
+            <w:pPr>
+              <w:pStyle w:val="Compact"/>
+              <w:jc w:val="left"/>
+            </w:pPr>
+            <w:r>
+              <w:t xml:space="preserve">Safety Focus Effects:</w:t>
+            </w:r>
+          </w:p>
+        </w:tc>
+        <w:tc>
+          <w:p>
+            <w:pStyle w:val="Compact"/>
+          </w:p>
+        </w:tc>
+        <w:tc>
+          <w:p>
+            <w:pStyle w:val="Compact"/>
+          </w:p>
+        </w:tc>
+        <w:tc>
+          <w:p>
+            <w:pStyle w:val="Compact"/>
+          </w:p>
+        </w:tc>
+      </w:tr>
+      <w:tr>
+        <w:tc>
+          <w:p>
+            <w:pPr>
+              <w:pStyle w:val="Compact"/>
+              <w:jc w:val="left"/>
+            </w:pPr>
+            <w:r>
+              <w:t xml:space="preserve">Unspecified</w:t>
+            </w:r>
+          </w:p>
+        </w:tc>
+        <w:tc>
+          <w:p>
+            <w:pPr>
+              <w:pStyle w:val="Compact"/>
+              <w:jc w:val="left"/>
+            </w:pPr>
+            <w:r>
+              <w:t xml:space="preserve">-0.68</w:t>
+            </w:r>
+          </w:p>
+        </w:tc>
+        <w:tc>
+          <w:p>
+            <w:pStyle w:val="Compact"/>
+          </w:p>
+        </w:tc>
+        <w:tc>
+          <w:p>
+            <w:pStyle w:val="Compact"/>
+          </w:p>
+        </w:tc>
+      </w:tr>
+      <w:tr>
+        <w:tc>
+          <w:p>
+            <w:pPr>
+              <w:pStyle w:val="Compact"/>
+              <w:jc w:val="left"/>
+            </w:pPr>
+            <w:r>
+              <w:t xml:space="preserve">Horizontal curve</w:t>
+            </w:r>
+          </w:p>
+        </w:tc>
+        <w:tc>
+          <w:p>
+            <w:pPr>
+              <w:pStyle w:val="Compact"/>
+              <w:jc w:val="left"/>
+            </w:pPr>
+            <w:r>
+              <w:t xml:space="preserve">-0.78</w:t>
+            </w:r>
+          </w:p>
+        </w:tc>
+        <w:tc>
+          <w:p>
+            <w:pStyle w:val="Compact"/>
+          </w:p>
+        </w:tc>
+        <w:tc>
+          <w:p>
+            <w:pStyle w:val="Compact"/>
+          </w:p>
+        </w:tc>
+      </w:tr>
+      <w:tr>
+        <w:tc>
+          <w:p>
+            <w:pPr>
+              <w:pStyle w:val="Compact"/>
+              <w:jc w:val="left"/>
+            </w:pPr>
+            <w:r>
+              <w:t xml:space="preserve">Work zone</w:t>
+            </w:r>
+          </w:p>
+        </w:tc>
+        <w:tc>
+          <w:p>
+            <w:pPr>
+              <w:pStyle w:val="Compact"/>
+              <w:jc w:val="left"/>
+            </w:pPr>
+            <w:r>
+              <w:t xml:space="preserve">-1.37</w:t>
+            </w:r>
+          </w:p>
+        </w:tc>
+        <w:tc>
+          <w:p>
+            <w:pStyle w:val="Compact"/>
+          </w:p>
+        </w:tc>
+        <w:tc>
+          <w:p>
+            <w:pStyle w:val="Compact"/>
+          </w:p>
+        </w:tc>
+      </w:tr>
+    </w:tbl>
+    <w:p>
+      <w:pPr>
         <w:pStyle w:val="Heading3"/>
       </w:pPr>
-      <w:bookmarkStart w:id="38" w:name="h2b"/>
-      <w:bookmarkEnd w:id="38"/>
+      <w:bookmarkStart w:id="37" w:name="h2b"/>
+      <w:bookmarkEnd w:id="37"/>
       <w:r>
         <w:t xml:space="preserve">H2B</w:t>
       </w:r>
@@ -6985,8 +8612,8 @@
       <w:pPr>
         <w:pStyle w:val="Heading3"/>
       </w:pPr>
-      <w:bookmarkStart w:id="39" w:name="h2c"/>
-      <w:bookmarkEnd w:id="39"/>
+      <w:bookmarkStart w:id="38" w:name="h2c"/>
+      <w:bookmarkEnd w:id="38"/>
       <w:r>
         <w:t xml:space="preserve">H2C</w:t>
       </w:r>
@@ -7139,8 +8766,8 @@
       <w:pPr>
         <w:pStyle w:val="Heading3"/>
       </w:pPr>
-      <w:bookmarkStart w:id="40" w:name="h2a-1"/>
-      <w:bookmarkEnd w:id="40"/>
+      <w:bookmarkStart w:id="39" w:name="h2a-1"/>
+      <w:bookmarkEnd w:id="39"/>
       <w:r>
         <w:t xml:space="preserve">H2A'</w:t>
       </w:r>
@@ -7661,8 +9288,8 @@
       <w:pPr>
         <w:pStyle w:val="Heading3"/>
       </w:pPr>
-      <w:bookmarkStart w:id="41" w:name="h2c-1"/>
-      <w:bookmarkEnd w:id="41"/>
+      <w:bookmarkStart w:id="40" w:name="h2c-1"/>
+      <w:bookmarkEnd w:id="40"/>
       <w:r>
         <w:t xml:space="preserve">H2C'</w:t>
       </w:r>
@@ -8175,8 +9802,8 @@
       <w:pPr>
         <w:pStyle w:val="Heading2"/>
       </w:pPr>
-      <w:bookmarkStart w:id="42" w:name="h3-downstream-hypothesis"/>
-      <w:bookmarkEnd w:id="42"/>
+      <w:bookmarkStart w:id="41" w:name="h3-downstream-hypothesis"/>
+      <w:bookmarkEnd w:id="41"/>
       <w:r>
         <w:t xml:space="preserve">H3: Downstream Hypothesis</w:t>
       </w:r>
@@ -8185,8 +9812,8 @@
       <w:pPr>
         <w:pStyle w:val="Heading3"/>
       </w:pPr>
-      <w:bookmarkStart w:id="43" w:name="h3a"/>
-      <w:bookmarkEnd w:id="43"/>
+      <w:bookmarkStart w:id="42" w:name="h3a"/>
+      <w:bookmarkEnd w:id="42"/>
       <w:r>
         <w:t xml:space="preserve">H3A</w:t>
       </w:r>
@@ -8331,8 +9958,8 @@
       <w:pPr>
         <w:pStyle w:val="Heading3"/>
       </w:pPr>
-      <w:bookmarkStart w:id="44" w:name="h3b"/>
-      <w:bookmarkEnd w:id="44"/>
+      <w:bookmarkStart w:id="43" w:name="h3b"/>
+      <w:bookmarkEnd w:id="43"/>
       <w:r>
         <w:t xml:space="preserve">H3B</w:t>
       </w:r>
@@ -8857,8 +10484,8 @@
       <w:pPr>
         <w:pStyle w:val="Heading3"/>
       </w:pPr>
-      <w:bookmarkStart w:id="45" w:name="h3c"/>
-      <w:bookmarkEnd w:id="45"/>
+      <w:bookmarkStart w:id="44" w:name="h3c"/>
+      <w:bookmarkEnd w:id="44"/>
       <w:r>
         <w:t xml:space="preserve">H3C</w:t>
       </w:r>
@@ -9229,8 +10856,8 @@
       <w:pPr>
         <w:pStyle w:val="Heading3"/>
       </w:pPr>
-      <w:bookmarkStart w:id="46" w:name="h3a-1"/>
-      <w:bookmarkEnd w:id="46"/>
+      <w:bookmarkStart w:id="45" w:name="h3a-1"/>
+      <w:bookmarkEnd w:id="45"/>
       <w:r>
         <w:t xml:space="preserve">H3A'</w:t>
       </w:r>
@@ -9375,8 +11002,8 @@
       <w:pPr>
         <w:pStyle w:val="Heading3"/>
       </w:pPr>
-      <w:bookmarkStart w:id="47" w:name="h3b-1"/>
-      <w:bookmarkEnd w:id="47"/>
+      <w:bookmarkStart w:id="46" w:name="h3b-1"/>
+      <w:bookmarkEnd w:id="46"/>
       <w:r>
         <w:t xml:space="preserve">H3B'</w:t>
       </w:r>
@@ -9941,8 +11568,8 @@
       <w:pPr>
         <w:pStyle w:val="Heading1"/>
       </w:pPr>
-      <w:bookmarkStart w:id="48" w:name="discussion"/>
-      <w:bookmarkEnd w:id="48"/>
+      <w:bookmarkStart w:id="47" w:name="discussion"/>
+      <w:bookmarkEnd w:id="47"/>
       <w:r>
         <w:t xml:space="preserve">Discussion</w:t>
       </w:r>
@@ -9951,8 +11578,8 @@
       <w:pPr>
         <w:pStyle w:val="Heading1"/>
       </w:pPr>
-      <w:bookmarkStart w:id="49" w:name="references"/>
-      <w:bookmarkEnd w:id="49"/>
+      <w:bookmarkStart w:id="48" w:name="references"/>
+      <w:bookmarkEnd w:id="48"/>
       <w:r>
         <w:t xml:space="preserve">References</w:t>
       </w:r>
@@ -10722,7 +12349,7 @@
     </w:lvl>
   </w:abstractNum>
   <w:abstractNum w:abstractNumId="990">
-    <w:nsid w:val="e3bc935a"/>
+    <w:nsid w:val="d7f79d8d"/>
     <w:multiLevelType w:val="multilevel"/>
     <w:lvl w:ilvl="0">
       <w:numFmt w:val="bullet"/>
@@ -10802,96 +12429,8 @@
       </w:pPr>
     </w:lvl>
   </w:abstractNum>
-  <w:abstractNum w:abstractNumId="99731">
-    <w:nsid w:val="dca06f49"/>
-    <w:multiLevelType w:val="multilevel"/>
-    <w:lvl w:ilvl="0">
-      <w:start w:val="1"/>
-      <w:numFmt w:val="lowerLetter"/>
-      <w:lvlText w:val="(%1)"/>
-      <w:lvlJc w:val="left"/>
-      <w:pPr>
-        <w:tabs>
-          <w:tab w:val="num" w:pos="0"/>
-        </w:tabs>
-        <w:ind w:left="480" w:hanging="480"/>
-      </w:pPr>
-    </w:lvl>
-    <w:lvl w:ilvl="1">
-      <w:start w:val="1"/>
-      <w:numFmt w:val="lowerLetter"/>
-      <w:lvlText w:val="(%2)"/>
-      <w:lvlJc w:val="left"/>
-      <w:pPr>
-        <w:tabs>
-          <w:tab w:val="num" w:pos="720"/>
-        </w:tabs>
-        <w:ind w:left="1200" w:hanging="480"/>
-      </w:pPr>
-    </w:lvl>
-    <w:lvl w:ilvl="2">
-      <w:start w:val="1"/>
-      <w:numFmt w:val="lowerLetter"/>
-      <w:lvlText w:val="(%3)"/>
-      <w:lvlJc w:val="left"/>
-      <w:pPr>
-        <w:tabs>
-          <w:tab w:val="num" w:pos="1440"/>
-        </w:tabs>
-        <w:ind w:left="1920" w:hanging="480"/>
-      </w:pPr>
-    </w:lvl>
-    <w:lvl w:ilvl="3">
-      <w:start w:val="1"/>
-      <w:numFmt w:val="lowerLetter"/>
-      <w:lvlText w:val="(%4)"/>
-      <w:lvlJc w:val="left"/>
-      <w:pPr>
-        <w:tabs>
-          <w:tab w:val="num" w:pos="2160"/>
-        </w:tabs>
-        <w:ind w:left="2640" w:hanging="480"/>
-      </w:pPr>
-    </w:lvl>
-    <w:lvl w:ilvl="4">
-      <w:start w:val="1"/>
-      <w:numFmt w:val="lowerLetter"/>
-      <w:lvlText w:val="(%5)"/>
-      <w:lvlJc w:val="left"/>
-      <w:pPr>
-        <w:tabs>
-          <w:tab w:val="num" w:pos="2880"/>
-        </w:tabs>
-        <w:ind w:left="3360" w:hanging="480"/>
-      </w:pPr>
-    </w:lvl>
-    <w:lvl w:ilvl="5">
-      <w:start w:val="1"/>
-      <w:numFmt w:val="lowerLetter"/>
-      <w:lvlText w:val="(%6)"/>
-      <w:lvlJc w:val="left"/>
-      <w:pPr>
-        <w:tabs>
-          <w:tab w:val="num" w:pos="3600"/>
-        </w:tabs>
-        <w:ind w:left="4080" w:hanging="480"/>
-      </w:pPr>
-    </w:lvl>
-    <w:lvl w:ilvl="6">
-      <w:start w:val="1"/>
-      <w:numFmt w:val="lowerLetter"/>
-      <w:lvlText w:val="(%7)"/>
-      <w:lvlJc w:val="left"/>
-      <w:pPr>
-        <w:tabs>
-          <w:tab w:val="num" w:pos="4320"/>
-        </w:tabs>
-        <w:ind w:left="4800" w:hanging="480"/>
-      </w:pPr>
-    </w:lvl>
-  </w:abstractNum>
   <w:abstractNum w:abstractNumId="99411">
-    <w:nsid w:val="cea46eaf"/>
+    <w:nsid w:val="ef7630b3"/>
     <w:multiLevelType w:val="multilevel"/>
     <w:lvl w:ilvl="0">
       <w:start w:val="1"/>
@@ -10979,7 +12518,7 @@
     </w:lvl>
   </w:abstractNum>
   <w:abstractNum w:abstractNumId="99811">
-    <w:nsid w:val="b97940bf"/>
+    <w:nsid w:val="b7149812"/>
     <w:multiLevelType w:val="multilevel"/>
     <w:lvl w:ilvl="0">
       <w:start w:val="1"/>
@@ -11139,7 +12678,7 @@
     <w:abstractNumId w:val="990"/>
   </w:num>
   <w:num w:numId="1001">
-    <w:abstractNumId w:val="99731"/>
+    <w:abstractNumId w:val="99411"/>
     <w:lvlOverride w:ilvl="0">
       <w:startOverride w:val="1"/>
     </w:lvlOverride>
@@ -11163,7 +12702,7 @@
     </w:lvlOverride>
   </w:num>
   <w:num w:numId="1002">
-    <w:abstractNumId w:val="99411"/>
+    <w:abstractNumId w:val="99811"/>
     <w:lvlOverride w:ilvl="0">
       <w:startOverride w:val="1"/>
     </w:lvlOverride>
@@ -11187,30 +12726,6 @@
     </w:lvlOverride>
   </w:num>
   <w:num w:numId="1003">
-    <w:abstractNumId w:val="99811"/>
-    <w:lvlOverride w:ilvl="0">
-      <w:startOverride w:val="1"/>
-    </w:lvlOverride>
-    <w:lvlOverride w:ilvl="1">
-      <w:startOverride w:val="1"/>
-    </w:lvlOverride>
-    <w:lvlOverride w:ilvl="2">
-      <w:startOverride w:val="1"/>
-    </w:lvlOverride>
-    <w:lvlOverride w:ilvl="3">
-      <w:startOverride w:val="1"/>
-    </w:lvlOverride>
-    <w:lvlOverride w:ilvl="4">
-      <w:startOverride w:val="1"/>
-    </w:lvlOverride>
-    <w:lvlOverride w:ilvl="5">
-      <w:startOverride w:val="1"/>
-    </w:lvlOverride>
-    <w:lvlOverride w:ilvl="6">
-      <w:startOverride w:val="1"/>
-    </w:lvlOverride>
-  </w:num>
-  <w:num w:numId="1004">
     <w:abstractNumId w:val="99811"/>
     <w:lvlOverride w:ilvl="0">
       <w:startOverride w:val="1"/>

</xml_diff>